<commit_message>
docs(report): add workflow, project steps, and task tracker
Restructure PROJECT-REPORT with: project workflow (§2, step-by-step with
roles), project steps/phases with status (§3), and a done/to-do task
tracker (§4, T1-T25) cross-linked to features and phases. Render markdown
task checkboxes as done/to-do markers in the generated Word doc. Regenerate
PROJECT-REPORT.docx.
</commit_message>
<xml_diff>
--- a/docs/PROJECT-REPORT.docx
+++ b/docs/PROJECT-REPORT.docx
@@ -34,7 +34,7 @@
         <w:ind w:left="360"/>
       </w:pPr>
       <w:r>
-        <w:t xml:space="preserve">features, scope, tech stack, and status. **Whenever the project changes</w:t>
+        <w:t xml:space="preserve">tasks, features, scope, tech stack, workflow, and status. **Whenever the</w:t>
       </w:r>
     </w:p>
     <w:p>
@@ -43,7 +43,7 @@
         <w:ind w:left="360"/>
       </w:pPr>
       <w:r>
-        <w:t xml:space="preserve">(features added/removed, stack changed, scope adjusted), update this file in</w:t>
+        <w:t xml:space="preserve">project changes, update this file in the same commit.** See "Maintenance" at</w:t>
       </w:r>
     </w:p>
     <w:p>
@@ -52,7 +52,7 @@
         <w:ind w:left="360"/>
       </w:pPr>
       <w:r>
-        <w:t xml:space="preserve">the same commit.** See "Maintenance" at the bottom.</w:t>
+        <w:t xml:space="preserve">the bottom.</w:t>
       </w:r>
     </w:p>
     <w:p/>
@@ -111,6 +111,25 @@
       </w:r>
       <w:r>
         <w:t xml:space="preserve"> https://github.com/ttawmo/Capstone-Kiro</w:t>
+      </w:r>
+    </w:p>
+    <w:p>
+      <w:pPr>
+        <w:pStyle w:val="ListParagraph"/>
+        <w:numPr>
+          <w:ilvl w:val="0"/>
+          <w:numId w:val="1"/>
+        </w:numPr>
+      </w:pPr>
+      <w:r>
+        <w:rPr>
+          <w:b/>
+          <w:bCs/>
+        </w:rPr>
+        <w:t xml:space="preserve">Timeline:</w:t>
+      </w:r>
+      <w:r>
+        <w:t xml:space="preserve"> 15 days, part-time, 6-person team</w:t>
       </w:r>
     </w:p>
     <w:p/>
@@ -128,59 +147,152 @@
         <w:spacing w:before="160" w:after="80"/>
       </w:pPr>
       <w:r>
-        <w:t xml:space="preserve">1. Summary</w:t>
-      </w:r>
-    </w:p>
-    <w:p/>
-    <w:p>
-      <w:r>
-        <w:t xml:space="preserve">A </w:t>
-      </w:r>
-      <w:r>
-        <w:rPr>
-          <w:b/>
-          <w:bCs/>
-        </w:rPr>
-        <w:t xml:space="preserve">proof-of-concept blockchain credential layer</w:t>
-      </w:r>
-      <w:r>
-        <w:t xml:space="preserve"> for high-risk construction</w:t>
-      </w:r>
-    </w:p>
-    <w:p>
-      <w:r>
-        <w:t xml:space="preserve">(crane lifting). Trusted issuers record portable worker and equipment credentials</w:t>
-      </w:r>
-    </w:p>
-    <w:p>
-      <w:r>
-        <w:t xml:space="preserve">on-chain. The system checks that every required credential is valid before a</w:t>
-      </w:r>
-    </w:p>
-    <w:p>
-      <w:r>
-        <w:t xml:space="preserve">lifting activity is cleared. The blockchain sits </w:t>
-      </w:r>
-      <w:r>
-        <w:rPr>
-          <w:b/>
-          <w:bCs/>
-        </w:rPr>
-        <w:t xml:space="preserve">underneath</w:t>
-      </w:r>
-      <w:r>
-        <w:t xml:space="preserve"> existing e-PTW</w:t>
-      </w:r>
-    </w:p>
-    <w:p>
-      <w:r>
-        <w:t xml:space="preserve">systems (e.g. Hubble); it does not replace them.</w:t>
-      </w:r>
-    </w:p>
-    <w:p/>
-    <w:p>
-      <w:r>
-        <w:t xml:space="preserve">This is a proof-of-concept, not a production industry blockchain.</w:t>
+        <w:t xml:space="preserve">Contents</w:t>
+      </w:r>
+    </w:p>
+    <w:p/>
+    <w:p>
+      <w:pPr>
+        <w:pStyle w:val="ListParagraph"/>
+        <w:numPr>
+          <w:ilvl w:val="0"/>
+          <w:numId w:val="1"/>
+        </w:numPr>
+      </w:pPr>
+      <w:r>
+        <w:t xml:space="preserve">Summary</w:t>
+      </w:r>
+    </w:p>
+    <w:p>
+      <w:pPr>
+        <w:pStyle w:val="ListParagraph"/>
+        <w:numPr>
+          <w:ilvl w:val="0"/>
+          <w:numId w:val="1"/>
+        </w:numPr>
+      </w:pPr>
+      <w:r>
+        <w:t xml:space="preserve">Project workflow (how the system behaves)</w:t>
+      </w:r>
+    </w:p>
+    <w:p>
+      <w:pPr>
+        <w:pStyle w:val="ListParagraph"/>
+        <w:numPr>
+          <w:ilvl w:val="0"/>
+          <w:numId w:val="1"/>
+        </w:numPr>
+      </w:pPr>
+      <w:r>
+        <w:t xml:space="preserve">Project steps (phases / schedule)</w:t>
+      </w:r>
+    </w:p>
+    <w:p>
+      <w:pPr>
+        <w:pStyle w:val="ListParagraph"/>
+        <w:numPr>
+          <w:ilvl w:val="0"/>
+          <w:numId w:val="1"/>
+        </w:numPr>
+      </w:pPr>
+      <w:r>
+        <w:t xml:space="preserve">Task tracker (done vs to-do)</w:t>
+      </w:r>
+    </w:p>
+    <w:p>
+      <w:pPr>
+        <w:pStyle w:val="ListParagraph"/>
+        <w:numPr>
+          <w:ilvl w:val="0"/>
+          <w:numId w:val="1"/>
+        </w:numPr>
+      </w:pPr>
+      <w:r>
+        <w:t xml:space="preserve">Tech stack</w:t>
+      </w:r>
+    </w:p>
+    <w:p>
+      <w:pPr>
+        <w:pStyle w:val="ListParagraph"/>
+        <w:numPr>
+          <w:ilvl w:val="0"/>
+          <w:numId w:val="1"/>
+        </w:numPr>
+      </w:pPr>
+      <w:r>
+        <w:t xml:space="preserve">Features</w:t>
+      </w:r>
+    </w:p>
+    <w:p>
+      <w:pPr>
+        <w:pStyle w:val="ListParagraph"/>
+        <w:numPr>
+          <w:ilvl w:val="0"/>
+          <w:numId w:val="1"/>
+        </w:numPr>
+      </w:pPr>
+      <w:r>
+        <w:t xml:space="preserve">Scope boundaries</w:t>
+      </w:r>
+    </w:p>
+    <w:p>
+      <w:pPr>
+        <w:pStyle w:val="ListParagraph"/>
+        <w:numPr>
+          <w:ilvl w:val="0"/>
+          <w:numId w:val="1"/>
+        </w:numPr>
+      </w:pPr>
+      <w:r>
+        <w:t xml:space="preserve">Architecture</w:t>
+      </w:r>
+    </w:p>
+    <w:p>
+      <w:pPr>
+        <w:pStyle w:val="ListParagraph"/>
+        <w:numPr>
+          <w:ilvl w:val="0"/>
+          <w:numId w:val="1"/>
+        </w:numPr>
+      </w:pPr>
+      <w:r>
+        <w:t xml:space="preserve">Repository layout</w:t>
+      </w:r>
+    </w:p>
+    <w:p>
+      <w:pPr>
+        <w:pStyle w:val="ListParagraph"/>
+        <w:numPr>
+          <w:ilvl w:val="0"/>
+          <w:numId w:val="1"/>
+        </w:numPr>
+      </w:pPr>
+      <w:r>
+        <w:t xml:space="preserve">How to run</w:t>
+      </w:r>
+    </w:p>
+    <w:p>
+      <w:pPr>
+        <w:pStyle w:val="ListParagraph"/>
+        <w:numPr>
+          <w:ilvl w:val="0"/>
+          <w:numId w:val="1"/>
+        </w:numPr>
+      </w:pPr>
+      <w:r>
+        <w:t xml:space="preserve">Change log</w:t>
+      </w:r>
+    </w:p>
+    <w:p>
+      <w:pPr>
+        <w:pStyle w:val="ListParagraph"/>
+        <w:numPr>
+          <w:ilvl w:val="0"/>
+          <w:numId w:val="1"/>
+        </w:numPr>
+      </w:pPr>
+      <w:r>
+        <w:t xml:space="preserve">Maintenance</w:t>
       </w:r>
     </w:p>
     <w:p/>
@@ -198,94 +310,59 @@
         <w:spacing w:before="160" w:after="80"/>
       </w:pPr>
       <w:r>
-        <w:t xml:space="preserve">2. Core workflow (what the MVP proves)</w:t>
-      </w:r>
-    </w:p>
-    <w:p/>
-    <w:p>
-      <w:pPr>
-        <w:pStyle w:val="ListParagraph"/>
-        <w:numPr>
-          <w:ilvl w:val="0"/>
-          <w:numId w:val="1"/>
-        </w:numPr>
-      </w:pPr>
-      <w:r>
-        <w:t xml:space="preserve">A trusted issuer issues a credential (worker or equipment).</w:t>
-      </w:r>
-    </w:p>
-    <w:p>
-      <w:pPr>
-        <w:pStyle w:val="ListParagraph"/>
-        <w:numPr>
-          <w:ilvl w:val="0"/>
-          <w:numId w:val="1"/>
-        </w:numPr>
-      </w:pPr>
-      <w:r>
-        <w:t xml:space="preserve">The credential is recorded on-chain (reference, issuer, expiry, status, hash).</w:t>
-      </w:r>
-    </w:p>
-    <w:p>
-      <w:pPr>
-        <w:pStyle w:val="ListParagraph"/>
-        <w:numPr>
-          <w:ilvl w:val="0"/>
-          <w:numId w:val="1"/>
-        </w:numPr>
-      </w:pPr>
-      <w:r>
-        <w:t xml:space="preserve">A contractor creates a lifting activity and assigns the required credentials.</w:t>
-      </w:r>
-    </w:p>
-    <w:p>
-      <w:pPr>
-        <w:pStyle w:val="ListParagraph"/>
-        <w:numPr>
-          <w:ilvl w:val="0"/>
-          <w:numId w:val="1"/>
-        </w:numPr>
-      </w:pPr>
-      <w:r>
-        <w:t xml:space="preserve">A smart contract checks all are valid, non-revoked, approved issuer → </w:t>
+        <w:t xml:space="preserve">1. Summary</w:t>
+      </w:r>
+    </w:p>
+    <w:p/>
+    <w:p>
+      <w:r>
+        <w:t xml:space="preserve">A </w:t>
       </w:r>
       <w:r>
         <w:rPr>
           <w:b/>
           <w:bCs/>
         </w:rPr>
-        <w:t xml:space="preserve">ELIGIBLE</w:t>
-      </w:r>
-      <w:r>
-        <w:t xml:space="preserve">.</w:t>
-      </w:r>
-    </w:p>
-    <w:p>
-      <w:pPr>
-        <w:pStyle w:val="ListParagraph"/>
-        <w:numPr>
-          <w:ilvl w:val="0"/>
-          <w:numId w:val="1"/>
-        </w:numPr>
-      </w:pPr>
-      <w:r>
-        <w:t xml:space="preserve">Revoking one credential makes the same check return </w:t>
+        <w:t xml:space="preserve">proof-of-concept blockchain credential layer</w:t>
+      </w:r>
+      <w:r>
+        <w:t xml:space="preserve"> for high-risk construction</w:t>
+      </w:r>
+    </w:p>
+    <w:p>
+      <w:r>
+        <w:t xml:space="preserve">(crane lifting). Trusted issuers record portable worker and equipment credentials</w:t>
+      </w:r>
+    </w:p>
+    <w:p>
+      <w:r>
+        <w:t xml:space="preserve">on-chain. The system checks that every required credential is valid before a</w:t>
+      </w:r>
+    </w:p>
+    <w:p>
+      <w:r>
+        <w:t xml:space="preserve">lifting activity is cleared. The blockchain sits </w:t>
       </w:r>
       <w:r>
         <w:rPr>
           <w:b/>
           <w:bCs/>
         </w:rPr>
-        <w:t xml:space="preserve">NOT ELIGIBLE</w:t>
-      </w:r>
-      <w:r>
-        <w:t xml:space="preserve">.</w:t>
-      </w:r>
-    </w:p>
-    <w:p/>
-    <w:p>
-      <w:r>
-        <w:t xml:space="preserve">Step 5 is the demonstration centerpiece.</w:t>
+        <w:t xml:space="preserve">underneath</w:t>
+      </w:r>
+      <w:r>
+        <w:t xml:space="preserve"> existing e-PTW</w:t>
+      </w:r>
+    </w:p>
+    <w:p>
+      <w:r>
+        <w:t xml:space="preserve">systems (e.g. Hubble); it does not replace them.</w:t>
+      </w:r>
+    </w:p>
+    <w:p/>
+    <w:p>
+      <w:r>
+        <w:t xml:space="preserve">This is a proof-of-concept, not a production industry blockchain.</w:t>
       </w:r>
     </w:p>
     <w:p/>
@@ -303,7 +380,347 @@
         <w:spacing w:before="160" w:after="80"/>
       </w:pPr>
       <w:r>
-        <w:t xml:space="preserve">3. Tech stack (actual installed versions)</w:t>
+        <w:t xml:space="preserve">2. Project workflow (how the system behaves)</w:t>
+      </w:r>
+    </w:p>
+    <w:p/>
+    <w:p>
+      <w:r>
+        <w:t xml:space="preserve">The core end-to-end flow the project proves. Step 5 (the failure case) is the</w:t>
+      </w:r>
+    </w:p>
+    <w:p>
+      <w:r>
+        <w:t xml:space="preserve">demonstration centerpiece.</w:t>
+      </w:r>
+    </w:p>
+    <w:p/>
+    <w:p>
+      <w:pPr>
+        <w:shd w:fill="0D1117"/>
+      </w:pPr>
+      <w:r>
+        <w:rPr>
+          <w:color w:val="C9D1D9"/>
+          <w:sz w:val="18"/>
+          <w:szCs w:val="18"/>
+          <w:rFonts w:ascii="Consolas" w:cs="Consolas" w:eastAsia="Consolas" w:hAnsi="Consolas"/>
+        </w:rPr>
+        <w:t xml:space="preserve">STEP 1  Issuer issues a credential</w:t>
+      </w:r>
+    </w:p>
+    <w:p>
+      <w:pPr>
+        <w:shd w:fill="0D1117"/>
+      </w:pPr>
+      <w:r>
+        <w:rPr>
+          <w:color w:val="C9D1D9"/>
+          <w:sz w:val="18"/>
+          <w:szCs w:val="18"/>
+          <w:rFonts w:ascii="Consolas" w:cs="Consolas" w:eastAsia="Consolas" w:hAnsi="Consolas"/>
+        </w:rPr>
+        <w:t xml:space="preserve">        (MOM / Authorised Examiner / training provider)</w:t>
+      </w:r>
+    </w:p>
+    <w:p>
+      <w:pPr>
+        <w:shd w:fill="0D1117"/>
+      </w:pPr>
+      <w:r>
+        <w:rPr>
+          <w:color w:val="C9D1D9"/>
+          <w:sz w:val="18"/>
+          <w:szCs w:val="18"/>
+          <w:rFonts w:ascii="Consolas" w:cs="Consolas" w:eastAsia="Consolas" w:hAnsi="Consolas"/>
+        </w:rPr>
+        <w:t xml:space="preserve">            │</w:t>
+      </w:r>
+    </w:p>
+    <w:p>
+      <w:pPr>
+        <w:shd w:fill="0D1117"/>
+      </w:pPr>
+      <w:r>
+        <w:rPr>
+          <w:color w:val="C9D1D9"/>
+          <w:sz w:val="18"/>
+          <w:szCs w:val="18"/>
+          <w:rFonts w:ascii="Consolas" w:cs="Consolas" w:eastAsia="Consolas" w:hAnsi="Consolas"/>
+        </w:rPr>
+        <w:t xml:space="preserve">            ▼</w:t>
+      </w:r>
+    </w:p>
+    <w:p>
+      <w:pPr>
+        <w:shd w:fill="0D1117"/>
+      </w:pPr>
+      <w:r>
+        <w:rPr>
+          <w:color w:val="C9D1D9"/>
+          <w:sz w:val="18"/>
+          <w:szCs w:val="18"/>
+          <w:rFonts w:ascii="Consolas" w:cs="Consolas" w:eastAsia="Consolas" w:hAnsi="Consolas"/>
+        </w:rPr>
+        <w:t xml:space="preserve">STEP 2  Credential recorded ON-CHAIN</w:t>
+      </w:r>
+    </w:p>
+    <w:p>
+      <w:pPr>
+        <w:shd w:fill="0D1117"/>
+      </w:pPr>
+      <w:r>
+        <w:rPr>
+          <w:color w:val="C9D1D9"/>
+          <w:sz w:val="18"/>
+          <w:szCs w:val="18"/>
+          <w:rFonts w:ascii="Consolas" w:cs="Consolas" w:eastAsia="Consolas" w:hAnsi="Consolas"/>
+        </w:rPr>
+        <w:t xml:space="preserve">        ref · issuer · expiry · status · SHA-256 doc hash</w:t>
+      </w:r>
+    </w:p>
+    <w:p>
+      <w:pPr>
+        <w:shd w:fill="0D1117"/>
+      </w:pPr>
+      <w:r>
+        <w:rPr>
+          <w:color w:val="C9D1D9"/>
+          <w:sz w:val="18"/>
+          <w:szCs w:val="18"/>
+          <w:rFonts w:ascii="Consolas" w:cs="Consolas" w:eastAsia="Consolas" w:hAnsi="Consolas"/>
+        </w:rPr>
+        <w:t xml:space="preserve">            │</w:t>
+      </w:r>
+    </w:p>
+    <w:p>
+      <w:pPr>
+        <w:shd w:fill="0D1117"/>
+      </w:pPr>
+      <w:r>
+        <w:rPr>
+          <w:color w:val="C9D1D9"/>
+          <w:sz w:val="18"/>
+          <w:szCs w:val="18"/>
+          <w:rFonts w:ascii="Consolas" w:cs="Consolas" w:eastAsia="Consolas" w:hAnsi="Consolas"/>
+        </w:rPr>
+        <w:t xml:space="preserve">            ▼</w:t>
+      </w:r>
+    </w:p>
+    <w:p>
+      <w:pPr>
+        <w:shd w:fill="0D1117"/>
+      </w:pPr>
+      <w:r>
+        <w:rPr>
+          <w:color w:val="C9D1D9"/>
+          <w:sz w:val="18"/>
+          <w:szCs w:val="18"/>
+          <w:rFonts w:ascii="Consolas" w:cs="Consolas" w:eastAsia="Consolas" w:hAnsi="Consolas"/>
+        </w:rPr>
+        <w:t xml:space="preserve">STEP 3  Contractor creates a lifting activity</w:t>
+      </w:r>
+    </w:p>
+    <w:p>
+      <w:pPr>
+        <w:shd w:fill="0D1117"/>
+      </w:pPr>
+      <w:r>
+        <w:rPr>
+          <w:color w:val="C9D1D9"/>
+          <w:sz w:val="18"/>
+          <w:szCs w:val="18"/>
+          <w:rFonts w:ascii="Consolas" w:cs="Consolas" w:eastAsia="Consolas" w:hAnsi="Consolas"/>
+        </w:rPr>
+        <w:t xml:space="preserve">        assigns required credentials (crane, operator, supervisor, rigger, signalman)</w:t>
+      </w:r>
+    </w:p>
+    <w:p>
+      <w:pPr>
+        <w:shd w:fill="0D1117"/>
+      </w:pPr>
+      <w:r>
+        <w:rPr>
+          <w:color w:val="C9D1D9"/>
+          <w:sz w:val="18"/>
+          <w:szCs w:val="18"/>
+          <w:rFonts w:ascii="Consolas" w:cs="Consolas" w:eastAsia="Consolas" w:hAnsi="Consolas"/>
+        </w:rPr>
+        <w:t xml:space="preserve">            │</w:t>
+      </w:r>
+    </w:p>
+    <w:p>
+      <w:pPr>
+        <w:shd w:fill="0D1117"/>
+      </w:pPr>
+      <w:r>
+        <w:rPr>
+          <w:color w:val="C9D1D9"/>
+          <w:sz w:val="18"/>
+          <w:szCs w:val="18"/>
+          <w:rFonts w:ascii="Consolas" w:cs="Consolas" w:eastAsia="Consolas" w:hAnsi="Consolas"/>
+        </w:rPr>
+        <w:t xml:space="preserve">            ▼</w:t>
+      </w:r>
+    </w:p>
+    <w:p>
+      <w:pPr>
+        <w:shd w:fill="0D1117"/>
+      </w:pPr>
+      <w:r>
+        <w:rPr>
+          <w:color w:val="C9D1D9"/>
+          <w:sz w:val="18"/>
+          <w:szCs w:val="18"/>
+          <w:rFonts w:ascii="Consolas" w:cs="Consolas" w:eastAsia="Consolas" w:hAnsi="Consolas"/>
+        </w:rPr>
+        <w:t xml:space="preserve">STEP 4  Smart contract checks eligibility</w:t>
+      </w:r>
+    </w:p>
+    <w:p>
+      <w:pPr>
+        <w:shd w:fill="0D1117"/>
+      </w:pPr>
+      <w:r>
+        <w:rPr>
+          <w:color w:val="C9D1D9"/>
+          <w:sz w:val="18"/>
+          <w:szCs w:val="18"/>
+          <w:rFonts w:ascii="Consolas" w:cs="Consolas" w:eastAsia="Consolas" w:hAnsi="Consolas"/>
+        </w:rPr>
+        <w:t xml:space="preserve">        all required credentials valid + non-revoked + approved issuer?</w:t>
+      </w:r>
+    </w:p>
+    <w:p>
+      <w:pPr>
+        <w:shd w:fill="0D1117"/>
+      </w:pPr>
+      <w:r>
+        <w:rPr>
+          <w:color w:val="C9D1D9"/>
+          <w:sz w:val="18"/>
+          <w:szCs w:val="18"/>
+          <w:rFonts w:ascii="Consolas" w:cs="Consolas" w:eastAsia="Consolas" w:hAnsi="Consolas"/>
+        </w:rPr>
+        <w:t xml:space="preserve">            │</w:t>
+      </w:r>
+    </w:p>
+    <w:p>
+      <w:pPr>
+        <w:shd w:fill="0D1117"/>
+      </w:pPr>
+      <w:r>
+        <w:rPr>
+          <w:color w:val="C9D1D9"/>
+          <w:sz w:val="18"/>
+          <w:szCs w:val="18"/>
+          <w:rFonts w:ascii="Consolas" w:cs="Consolas" w:eastAsia="Consolas" w:hAnsi="Consolas"/>
+        </w:rPr>
+        <w:t xml:space="preserve">     ┌──────┴───────┐</w:t>
+      </w:r>
+    </w:p>
+    <w:p>
+      <w:pPr>
+        <w:shd w:fill="0D1117"/>
+      </w:pPr>
+      <w:r>
+        <w:rPr>
+          <w:color w:val="C9D1D9"/>
+          <w:sz w:val="18"/>
+          <w:szCs w:val="18"/>
+          <w:rFonts w:ascii="Consolas" w:cs="Consolas" w:eastAsia="Consolas" w:hAnsi="Consolas"/>
+        </w:rPr>
+        <w:t xml:space="preserve">     ▼              ▼</w:t>
+      </w:r>
+    </w:p>
+    <w:p>
+      <w:pPr>
+        <w:shd w:fill="0D1117"/>
+      </w:pPr>
+      <w:r>
+        <w:rPr>
+          <w:color w:val="C9D1D9"/>
+          <w:sz w:val="18"/>
+          <w:szCs w:val="18"/>
+          <w:rFonts w:ascii="Consolas" w:cs="Consolas" w:eastAsia="Consolas" w:hAnsi="Consolas"/>
+        </w:rPr>
+        <w:t xml:space="preserve">  ELIGIBLE      NOT ELIGIBLE</w:t>
+      </w:r>
+    </w:p>
+    <w:p>
+      <w:pPr>
+        <w:shd w:fill="0D1117"/>
+      </w:pPr>
+      <w:r>
+        <w:rPr>
+          <w:color w:val="C9D1D9"/>
+          <w:sz w:val="18"/>
+          <w:szCs w:val="18"/>
+          <w:rFonts w:ascii="Consolas" w:cs="Consolas" w:eastAsia="Consolas" w:hAnsi="Consolas"/>
+        </w:rPr>
+        <w:t xml:space="preserve">     │              │</w:t>
+      </w:r>
+    </w:p>
+    <w:p>
+      <w:pPr>
+        <w:shd w:fill="0D1117"/>
+      </w:pPr>
+      <w:r>
+        <w:rPr>
+          <w:color w:val="C9D1D9"/>
+          <w:sz w:val="18"/>
+          <w:szCs w:val="18"/>
+          <w:rFonts w:ascii="Consolas" w:cs="Consolas" w:eastAsia="Consolas" w:hAnsi="Consolas"/>
+        </w:rPr>
+        <w:t xml:space="preserve">     ▼              ▼</w:t>
+      </w:r>
+    </w:p>
+    <w:p>
+      <w:pPr>
+        <w:shd w:fill="0D1117"/>
+      </w:pPr>
+      <w:r>
+        <w:rPr>
+          <w:color w:val="C9D1D9"/>
+          <w:sz w:val="18"/>
+          <w:szCs w:val="18"/>
+          <w:rFonts w:ascii="Consolas" w:cs="Consolas" w:eastAsia="Consolas" w:hAnsi="Consolas"/>
+        </w:rPr>
+        <w:t xml:space="preserve">STEP 5  Project owner      Revoke ONE credential and</w:t>
+      </w:r>
+    </w:p>
+    <w:p>
+      <w:pPr>
+        <w:shd w:fill="0D1117"/>
+      </w:pPr>
+      <w:r>
+        <w:rPr>
+          <w:color w:val="C9D1D9"/>
+          <w:sz w:val="18"/>
+          <w:szCs w:val="18"/>
+          <w:rFonts w:ascii="Consolas" w:cs="Consolas" w:eastAsia="Consolas" w:hAnsi="Consolas"/>
+        </w:rPr>
+        <w:t xml:space="preserve">        approves clearance re-check → NOT ELIGIBLE</w:t>
+      </w:r>
+    </w:p>
+    <w:p>
+      <w:pPr>
+        <w:shd w:fill="0D1117"/>
+      </w:pPr>
+      <w:r>
+        <w:rPr>
+          <w:color w:val="C9D1D9"/>
+          <w:sz w:val="18"/>
+          <w:szCs w:val="18"/>
+          <w:rFonts w:ascii="Consolas" w:cs="Consolas" w:eastAsia="Consolas" w:hAnsi="Consolas"/>
+        </w:rPr>
+        <w:t xml:space="preserve">        → lift proceeds    (lift automatically blocked)</w:t>
+      </w:r>
+    </w:p>
+    <w:p/>
+    <w:p>
+      <w:r>
+        <w:t xml:space="preserve">Who does what (roles enforced on-chain):</w:t>
       </w:r>
     </w:p>
     <w:p/>
@@ -506,377 +923,62 @@
           </w:p>
         </w:tc>
       </w:tr>
-      <w:tr>
-        <w:tc>
-          <w:tcPr>
-            <w:tcBorders>
-              <w:top w:val="single" w:color="CCCCCC" w:sz="1"/>
-              <w:left w:val="single" w:color="CCCCCC" w:sz="1"/>
-              <w:bottom w:val="single" w:color="CCCCCC" w:sz="1"/>
-              <w:right w:val="single" w:color="CCCCCC" w:sz="1"/>
-            </w:tcBorders>
-          </w:tcPr>
-          <w:p>
-            <w:r/>
-          </w:p>
-        </w:tc>
-        <w:tc>
-          <w:tcPr>
-            <w:tcBorders>
-              <w:top w:val="single" w:color="CCCCCC" w:sz="1"/>
-              <w:left w:val="single" w:color="CCCCCC" w:sz="1"/>
-              <w:bottom w:val="single" w:color="CCCCCC" w:sz="1"/>
-              <w:right w:val="single" w:color="CCCCCC" w:sz="1"/>
-            </w:tcBorders>
-          </w:tcPr>
-          <w:p>
-            <w:r/>
-          </w:p>
-        </w:tc>
-        <w:tc>
-          <w:tcPr>
-            <w:tcBorders>
-              <w:top w:val="single" w:color="CCCCCC" w:sz="1"/>
-              <w:left w:val="single" w:color="CCCCCC" w:sz="1"/>
-              <w:bottom w:val="single" w:color="CCCCCC" w:sz="1"/>
-              <w:right w:val="single" w:color="CCCCCC" w:sz="1"/>
-            </w:tcBorders>
-          </w:tcPr>
-          <w:p>
-            <w:r/>
-          </w:p>
-        </w:tc>
-      </w:tr>
-      <w:tr>
-        <w:tc>
-          <w:tcPr>
-            <w:tcBorders>
-              <w:top w:val="single" w:color="CCCCCC" w:sz="1"/>
-              <w:left w:val="single" w:color="CCCCCC" w:sz="1"/>
-              <w:bottom w:val="single" w:color="CCCCCC" w:sz="1"/>
-              <w:right w:val="single" w:color="CCCCCC" w:sz="1"/>
-            </w:tcBorders>
-          </w:tcPr>
-          <w:p>
-            <w:r/>
-          </w:p>
-        </w:tc>
-        <w:tc>
-          <w:tcPr>
-            <w:tcBorders>
-              <w:top w:val="single" w:color="CCCCCC" w:sz="1"/>
-              <w:left w:val="single" w:color="CCCCCC" w:sz="1"/>
-              <w:bottom w:val="single" w:color="CCCCCC" w:sz="1"/>
-              <w:right w:val="single" w:color="CCCCCC" w:sz="1"/>
-            </w:tcBorders>
-          </w:tcPr>
-          <w:p>
-            <w:r/>
-          </w:p>
-        </w:tc>
-        <w:tc>
-          <w:tcPr>
-            <w:tcBorders>
-              <w:top w:val="single" w:color="CCCCCC" w:sz="1"/>
-              <w:left w:val="single" w:color="CCCCCC" w:sz="1"/>
-              <w:bottom w:val="single" w:color="CCCCCC" w:sz="1"/>
-              <w:right w:val="single" w:color="CCCCCC" w:sz="1"/>
-            </w:tcBorders>
-          </w:tcPr>
-          <w:p>
-            <w:r/>
-          </w:p>
-        </w:tc>
-      </w:tr>
-      <w:tr>
-        <w:tc>
-          <w:tcPr>
-            <w:tcBorders>
-              <w:top w:val="single" w:color="CCCCCC" w:sz="1"/>
-              <w:left w:val="single" w:color="CCCCCC" w:sz="1"/>
-              <w:bottom w:val="single" w:color="CCCCCC" w:sz="1"/>
-              <w:right w:val="single" w:color="CCCCCC" w:sz="1"/>
-            </w:tcBorders>
-          </w:tcPr>
-          <w:p>
-            <w:r/>
-          </w:p>
-        </w:tc>
-        <w:tc>
-          <w:tcPr>
-            <w:tcBorders>
-              <w:top w:val="single" w:color="CCCCCC" w:sz="1"/>
-              <w:left w:val="single" w:color="CCCCCC" w:sz="1"/>
-              <w:bottom w:val="single" w:color="CCCCCC" w:sz="1"/>
-              <w:right w:val="single" w:color="CCCCCC" w:sz="1"/>
-            </w:tcBorders>
-          </w:tcPr>
-          <w:p>
-            <w:r/>
-          </w:p>
-        </w:tc>
-        <w:tc>
-          <w:tcPr>
-            <w:tcBorders>
-              <w:top w:val="single" w:color="CCCCCC" w:sz="1"/>
-              <w:left w:val="single" w:color="CCCCCC" w:sz="1"/>
-              <w:bottom w:val="single" w:color="CCCCCC" w:sz="1"/>
-              <w:right w:val="single" w:color="CCCCCC" w:sz="1"/>
-            </w:tcBorders>
-          </w:tcPr>
-          <w:p>
-            <w:r/>
-          </w:p>
-        </w:tc>
-      </w:tr>
-      <w:tr>
-        <w:tc>
-          <w:tcPr>
-            <w:tcBorders>
-              <w:top w:val="single" w:color="CCCCCC" w:sz="1"/>
-              <w:left w:val="single" w:color="CCCCCC" w:sz="1"/>
-              <w:bottom w:val="single" w:color="CCCCCC" w:sz="1"/>
-              <w:right w:val="single" w:color="CCCCCC" w:sz="1"/>
-            </w:tcBorders>
-          </w:tcPr>
-          <w:p>
-            <w:r/>
-          </w:p>
-        </w:tc>
-        <w:tc>
-          <w:tcPr>
-            <w:tcBorders>
-              <w:top w:val="single" w:color="CCCCCC" w:sz="1"/>
-              <w:left w:val="single" w:color="CCCCCC" w:sz="1"/>
-              <w:bottom w:val="single" w:color="CCCCCC" w:sz="1"/>
-              <w:right w:val="single" w:color="CCCCCC" w:sz="1"/>
-            </w:tcBorders>
-          </w:tcPr>
-          <w:p>
-            <w:r/>
-          </w:p>
-        </w:tc>
-        <w:tc>
-          <w:tcPr>
-            <w:tcBorders>
-              <w:top w:val="single" w:color="CCCCCC" w:sz="1"/>
-              <w:left w:val="single" w:color="CCCCCC" w:sz="1"/>
-              <w:bottom w:val="single" w:color="CCCCCC" w:sz="1"/>
-              <w:right w:val="single" w:color="CCCCCC" w:sz="1"/>
-            </w:tcBorders>
-          </w:tcPr>
-          <w:p>
-            <w:r/>
-          </w:p>
-        </w:tc>
-      </w:tr>
-      <w:tr>
-        <w:tc>
-          <w:tcPr>
-            <w:tcBorders>
-              <w:top w:val="single" w:color="CCCCCC" w:sz="1"/>
-              <w:left w:val="single" w:color="CCCCCC" w:sz="1"/>
-              <w:bottom w:val="single" w:color="CCCCCC" w:sz="1"/>
-              <w:right w:val="single" w:color="CCCCCC" w:sz="1"/>
-            </w:tcBorders>
-          </w:tcPr>
-          <w:p>
-            <w:r/>
-          </w:p>
-        </w:tc>
-        <w:tc>
-          <w:tcPr>
-            <w:tcBorders>
-              <w:top w:val="single" w:color="CCCCCC" w:sz="1"/>
-              <w:left w:val="single" w:color="CCCCCC" w:sz="1"/>
-              <w:bottom w:val="single" w:color="CCCCCC" w:sz="1"/>
-              <w:right w:val="single" w:color="CCCCCC" w:sz="1"/>
-            </w:tcBorders>
-          </w:tcPr>
-          <w:p>
-            <w:r/>
-          </w:p>
-        </w:tc>
-        <w:tc>
-          <w:tcPr>
-            <w:tcBorders>
-              <w:top w:val="single" w:color="CCCCCC" w:sz="1"/>
-              <w:left w:val="single" w:color="CCCCCC" w:sz="1"/>
-              <w:bottom w:val="single" w:color="CCCCCC" w:sz="1"/>
-              <w:right w:val="single" w:color="CCCCCC" w:sz="1"/>
-            </w:tcBorders>
-          </w:tcPr>
-          <w:p>
-            <w:r/>
-          </w:p>
-        </w:tc>
-      </w:tr>
-      <w:tr>
-        <w:tc>
-          <w:tcPr>
-            <w:tcBorders>
-              <w:top w:val="single" w:color="CCCCCC" w:sz="1"/>
-              <w:left w:val="single" w:color="CCCCCC" w:sz="1"/>
-              <w:bottom w:val="single" w:color="CCCCCC" w:sz="1"/>
-              <w:right w:val="single" w:color="CCCCCC" w:sz="1"/>
-            </w:tcBorders>
-          </w:tcPr>
-          <w:p>
-            <w:r/>
-          </w:p>
-        </w:tc>
-        <w:tc>
-          <w:tcPr>
-            <w:tcBorders>
-              <w:top w:val="single" w:color="CCCCCC" w:sz="1"/>
-              <w:left w:val="single" w:color="CCCCCC" w:sz="1"/>
-              <w:bottom w:val="single" w:color="CCCCCC" w:sz="1"/>
-              <w:right w:val="single" w:color="CCCCCC" w:sz="1"/>
-            </w:tcBorders>
-          </w:tcPr>
-          <w:p>
-            <w:r/>
-          </w:p>
-        </w:tc>
-        <w:tc>
-          <w:tcPr>
-            <w:tcBorders>
-              <w:top w:val="single" w:color="CCCCCC" w:sz="1"/>
-              <w:left w:val="single" w:color="CCCCCC" w:sz="1"/>
-              <w:bottom w:val="single" w:color="CCCCCC" w:sz="1"/>
-              <w:right w:val="single" w:color="CCCCCC" w:sz="1"/>
-            </w:tcBorders>
-          </w:tcPr>
-          <w:p>
-            <w:r/>
-          </w:p>
-        </w:tc>
-      </w:tr>
-      <w:tr>
-        <w:tc>
-          <w:tcPr>
-            <w:tcBorders>
-              <w:top w:val="single" w:color="CCCCCC" w:sz="1"/>
-              <w:left w:val="single" w:color="CCCCCC" w:sz="1"/>
-              <w:bottom w:val="single" w:color="CCCCCC" w:sz="1"/>
-              <w:right w:val="single" w:color="CCCCCC" w:sz="1"/>
-            </w:tcBorders>
-          </w:tcPr>
-          <w:p>
-            <w:r/>
-          </w:p>
-        </w:tc>
-        <w:tc>
-          <w:tcPr>
-            <w:tcBorders>
-              <w:top w:val="single" w:color="CCCCCC" w:sz="1"/>
-              <w:left w:val="single" w:color="CCCCCC" w:sz="1"/>
-              <w:bottom w:val="single" w:color="CCCCCC" w:sz="1"/>
-              <w:right w:val="single" w:color="CCCCCC" w:sz="1"/>
-            </w:tcBorders>
-          </w:tcPr>
-          <w:p>
-            <w:r/>
-          </w:p>
-        </w:tc>
-        <w:tc>
-          <w:tcPr>
-            <w:tcBorders>
-              <w:top w:val="single" w:color="CCCCCC" w:sz="1"/>
-              <w:left w:val="single" w:color="CCCCCC" w:sz="1"/>
-              <w:bottom w:val="single" w:color="CCCCCC" w:sz="1"/>
-              <w:right w:val="single" w:color="CCCCCC" w:sz="1"/>
-            </w:tcBorders>
-          </w:tcPr>
-          <w:p>
-            <w:r/>
-          </w:p>
-        </w:tc>
-      </w:tr>
-      <w:tr>
-        <w:tc>
-          <w:tcPr>
-            <w:tcBorders>
-              <w:top w:val="single" w:color="CCCCCC" w:sz="1"/>
-              <w:left w:val="single" w:color="CCCCCC" w:sz="1"/>
-              <w:bottom w:val="single" w:color="CCCCCC" w:sz="1"/>
-              <w:right w:val="single" w:color="CCCCCC" w:sz="1"/>
-            </w:tcBorders>
-          </w:tcPr>
-          <w:p>
-            <w:r/>
-          </w:p>
-        </w:tc>
-        <w:tc>
-          <w:tcPr>
-            <w:tcBorders>
-              <w:top w:val="single" w:color="CCCCCC" w:sz="1"/>
-              <w:left w:val="single" w:color="CCCCCC" w:sz="1"/>
-              <w:bottom w:val="single" w:color="CCCCCC" w:sz="1"/>
-              <w:right w:val="single" w:color="CCCCCC" w:sz="1"/>
-            </w:tcBorders>
-          </w:tcPr>
-          <w:p>
-            <w:r/>
-          </w:p>
-        </w:tc>
-        <w:tc>
-          <w:tcPr>
-            <w:tcBorders>
-              <w:top w:val="single" w:color="CCCCCC" w:sz="1"/>
-              <w:left w:val="single" w:color="CCCCCC" w:sz="1"/>
-              <w:bottom w:val="single" w:color="CCCCCC" w:sz="1"/>
-              <w:right w:val="single" w:color="CCCCCC" w:sz="1"/>
-            </w:tcBorders>
-          </w:tcPr>
-          <w:p>
-            <w:r/>
-          </w:p>
-        </w:tc>
-      </w:tr>
-      <w:tr>
-        <w:tc>
-          <w:tcPr>
-            <w:tcBorders>
-              <w:top w:val="single" w:color="CCCCCC" w:sz="1"/>
-              <w:left w:val="single" w:color="CCCCCC" w:sz="1"/>
-              <w:bottom w:val="single" w:color="CCCCCC" w:sz="1"/>
-              <w:right w:val="single" w:color="CCCCCC" w:sz="1"/>
-            </w:tcBorders>
-          </w:tcPr>
-          <w:p>
-            <w:r/>
-          </w:p>
-        </w:tc>
-        <w:tc>
-          <w:tcPr>
-            <w:tcBorders>
-              <w:top w:val="single" w:color="CCCCCC" w:sz="1"/>
-              <w:left w:val="single" w:color="CCCCCC" w:sz="1"/>
-              <w:bottom w:val="single" w:color="CCCCCC" w:sz="1"/>
-              <w:right w:val="single" w:color="CCCCCC" w:sz="1"/>
-            </w:tcBorders>
-          </w:tcPr>
-          <w:p>
-            <w:r/>
-          </w:p>
-        </w:tc>
-        <w:tc>
-          <w:tcPr>
-            <w:tcBorders>
-              <w:top w:val="single" w:color="CCCCCC" w:sz="1"/>
-              <w:left w:val="single" w:color="CCCCCC" w:sz="1"/>
-              <w:bottom w:val="single" w:color="CCCCCC" w:sz="1"/>
-              <w:right w:val="single" w:color="CCCCCC" w:sz="1"/>
-            </w:tcBorders>
-          </w:tcPr>
-          <w:p>
-            <w:r/>
-          </w:p>
-        </w:tc>
-      </w:tr>
     </w:tbl>
     <w:p/>
+    <w:p/>
+    <w:p>
+      <w:r>
+        <w:t xml:space="preserve">Data split:</w:t>
+      </w:r>
+    </w:p>
+    <w:p>
+      <w:pPr>
+        <w:pStyle w:val="ListParagraph"/>
+        <w:numPr>
+          <w:ilvl w:val="0"/>
+          <w:numId w:val="1"/>
+        </w:numPr>
+      </w:pPr>
+      <w:r>
+        <w:rPr>
+          <w:b/>
+          <w:bCs/>
+        </w:rPr>
+        <w:t xml:space="preserve">On-chain:</w:t>
+      </w:r>
+      <w:r>
+        <w:t xml:space="preserve"> credential refs, issuer, expiry, status, revocation, document hash,</w:t>
+      </w:r>
+    </w:p>
+    <w:p>
+      <w:r>
+        <w:t xml:space="preserve">  and the eligibility logic.</w:t>
+      </w:r>
+    </w:p>
+    <w:p>
+      <w:pPr>
+        <w:pStyle w:val="ListParagraph"/>
+        <w:numPr>
+          <w:ilvl w:val="0"/>
+          <w:numId w:val="1"/>
+        </w:numPr>
+      </w:pPr>
+      <w:r>
+        <w:rPr>
+          <w:b/>
+          <w:bCs/>
+        </w:rPr>
+        <w:t xml:space="preserve">Off-chain (planned):</w:t>
+      </w:r>
+      <w:r>
+        <w:t xml:space="preserve"> PDFs, worker/machine metadata, activity detail,</w:t>
+      </w:r>
+    </w:p>
+    <w:p>
+      <w:r>
+        <w:t xml:space="preserve">  personal data (placeholders only).</w:t>
+      </w:r>
+    </w:p>
     <w:p/>
     <w:p>
       <w:pPr>
@@ -892,17 +994,18 @@
         <w:spacing w:before="160" w:after="80"/>
       </w:pPr>
       <w:r>
-        <w:t xml:space="preserve">4. Features</w:t>
-      </w:r>
-    </w:p>
-    <w:p/>
-    <w:p>
-      <w:pPr>
-        <w:pStyle w:val="Heading2"/>
-        <w:spacing w:before="160" w:after="80"/>
-      </w:pPr>
-      <w:r>
-        <w:t xml:space="preserve">Implemented (working in the MVP)</w:t>
+        <w:t xml:space="preserve">3. Project steps (phases / schedule)</w:t>
+      </w:r>
+    </w:p>
+    <w:p/>
+    <w:p>
+      <w:r>
+        <w:t xml:space="preserve">The 15-day plan. "MVP build" (steps that produce the working prototype) is done;</w:t>
+      </w:r>
+    </w:p>
+    <w:p>
+      <w:r>
+        <w:t xml:space="preserve">the remaining steps are integration, validation, and presentation.</w:t>
       </w:r>
     </w:p>
     <w:p/>
@@ -1040,115 +1143,6 @@
           </w:tcPr>
           <w:p>
             <w:r/>
-            <w:r/>
-          </w:p>
-        </w:tc>
-        <w:tc>
-          <w:tcPr>
-            <w:tcBorders>
-              <w:top w:val="single" w:color="CCCCCC" w:sz="1"/>
-              <w:left w:val="single" w:color="CCCCCC" w:sz="1"/>
-              <w:bottom w:val="single" w:color="CCCCCC" w:sz="1"/>
-              <w:right w:val="single" w:color="CCCCCC" w:sz="1"/>
-            </w:tcBorders>
-          </w:tcPr>
-          <w:p>
-            <w:r/>
-          </w:p>
-        </w:tc>
-      </w:tr>
-      <w:tr>
-        <w:tc>
-          <w:tcPr>
-            <w:tcBorders>
-              <w:top w:val="single" w:color="CCCCCC" w:sz="1"/>
-              <w:left w:val="single" w:color="CCCCCC" w:sz="1"/>
-              <w:bottom w:val="single" w:color="CCCCCC" w:sz="1"/>
-              <w:right w:val="single" w:color="CCCCCC" w:sz="1"/>
-            </w:tcBorders>
-          </w:tcPr>
-          <w:p>
-            <w:r/>
-          </w:p>
-        </w:tc>
-        <w:tc>
-          <w:tcPr>
-            <w:tcBorders>
-              <w:top w:val="single" w:color="CCCCCC" w:sz="1"/>
-              <w:left w:val="single" w:color="CCCCCC" w:sz="1"/>
-              <w:bottom w:val="single" w:color="CCCCCC" w:sz="1"/>
-              <w:right w:val="single" w:color="CCCCCC" w:sz="1"/>
-            </w:tcBorders>
-          </w:tcPr>
-          <w:p>
-            <w:r/>
-          </w:p>
-        </w:tc>
-        <w:tc>
-          <w:tcPr>
-            <w:tcBorders>
-              <w:top w:val="single" w:color="CCCCCC" w:sz="1"/>
-              <w:left w:val="single" w:color="CCCCCC" w:sz="1"/>
-              <w:bottom w:val="single" w:color="CCCCCC" w:sz="1"/>
-              <w:right w:val="single" w:color="CCCCCC" w:sz="1"/>
-            </w:tcBorders>
-          </w:tcPr>
-          <w:p>
-            <w:r/>
-          </w:p>
-        </w:tc>
-        <w:tc>
-          <w:tcPr>
-            <w:tcBorders>
-              <w:top w:val="single" w:color="CCCCCC" w:sz="1"/>
-              <w:left w:val="single" w:color="CCCCCC" w:sz="1"/>
-              <w:bottom w:val="single" w:color="CCCCCC" w:sz="1"/>
-              <w:right w:val="single" w:color="CCCCCC" w:sz="1"/>
-            </w:tcBorders>
-          </w:tcPr>
-          <w:p>
-            <w:r/>
-          </w:p>
-        </w:tc>
-      </w:tr>
-      <w:tr>
-        <w:tc>
-          <w:tcPr>
-            <w:tcBorders>
-              <w:top w:val="single" w:color="CCCCCC" w:sz="1"/>
-              <w:left w:val="single" w:color="CCCCCC" w:sz="1"/>
-              <w:bottom w:val="single" w:color="CCCCCC" w:sz="1"/>
-              <w:right w:val="single" w:color="CCCCCC" w:sz="1"/>
-            </w:tcBorders>
-          </w:tcPr>
-          <w:p>
-            <w:r/>
-          </w:p>
-        </w:tc>
-        <w:tc>
-          <w:tcPr>
-            <w:tcBorders>
-              <w:top w:val="single" w:color="CCCCCC" w:sz="1"/>
-              <w:left w:val="single" w:color="CCCCCC" w:sz="1"/>
-              <w:bottom w:val="single" w:color="CCCCCC" w:sz="1"/>
-              <w:right w:val="single" w:color="CCCCCC" w:sz="1"/>
-            </w:tcBorders>
-          </w:tcPr>
-          <w:p>
-            <w:r/>
-          </w:p>
-        </w:tc>
-        <w:tc>
-          <w:tcPr>
-            <w:tcBorders>
-              <w:top w:val="single" w:color="CCCCCC" w:sz="1"/>
-              <w:left w:val="single" w:color="CCCCCC" w:sz="1"/>
-              <w:bottom w:val="single" w:color="CCCCCC" w:sz="1"/>
-              <w:right w:val="single" w:color="CCCCCC" w:sz="1"/>
-            </w:tcBorders>
-          </w:tcPr>
-          <w:p>
-            <w:r/>
           </w:p>
         </w:tc>
         <w:tc>
@@ -1653,6 +1647,57 @@
       </w:tr>
     </w:tbl>
     <w:p/>
+    <w:p/>
+    <w:p>
+      <w:r>
+        <w:t xml:space="preserve">Legend: ✅ done · 🟡 partial · ⬜ to do</w:t>
+      </w:r>
+    </w:p>
+    <w:p/>
+    <w:p>
+      <w:r>
+        <w:t xml:space="preserve">Note: the MVP build (S0, S1, S3, S4, S5) is complete ahead of schedule. The</w:t>
+      </w:r>
+    </w:p>
+    <w:p>
+      <w:r>
+        <w:t xml:space="preserve">remaining work is business validation (S2 — the biggest project risk), optional</w:t>
+      </w:r>
+    </w:p>
+    <w:p>
+      <w:r>
+        <w:t xml:space="preserve">UI build-up (S6), and the presentation (S7–S9).</w:t>
+      </w:r>
+    </w:p>
+    <w:p/>
+    <w:p>
+      <w:pPr>
+        <w:pBdr>
+          <w:bottom w:val="single" w:color="DDDDDD" w:sz="6"/>
+        </w:pBdr>
+      </w:pPr>
+    </w:p>
+    <w:p/>
+    <w:p>
+      <w:pPr>
+        <w:pStyle w:val="Heading1"/>
+        <w:spacing w:before="160" w:after="80"/>
+      </w:pPr>
+      <w:r>
+        <w:t xml:space="preserve">4. Task tracker (done vs to-do)</w:t>
+      </w:r>
+    </w:p>
+    <w:p/>
+    <w:p>
+      <w:r>
+        <w:t xml:space="preserve">Running checklist. Check items off as they are completed and add a change-log row</w:t>
+      </w:r>
+    </w:p>
+    <w:p>
+      <w:r>
+        <w:t xml:space="preserve">(§11). Keep this in sync with §3 and §6.</w:t>
+      </w:r>
+    </w:p>
     <w:p/>
     <w:p>
       <w:pPr>
@@ -1660,7 +1705,599 @@
         <w:spacing w:before="160" w:after="80"/>
       </w:pPr>
       <w:r>
-        <w:t xml:space="preserve">Planned / build-up (not yet implemented)</w:t>
+        <w:t xml:space="preserve">Done</w:t>
+      </w:r>
+    </w:p>
+    <w:p/>
+    <w:p>
+      <w:pPr>
+        <w:pStyle w:val="ListParagraph"/>
+        <w:numPr>
+          <w:ilvl w:val="0"/>
+          <w:numId w:val="1"/>
+        </w:numPr>
+      </w:pPr>
+      <w:r>
+        <w:rPr>
+          <w:b/>
+          <w:bCs/>
+          <w:color w:val="0A7227"/>
+        </w:rPr>
+        <w:t xml:space="preserve">✓ </w:t>
+      </w:r>
+      <w:r>
+        <w:t xml:space="preserve">T1. Create repo, steering files, and conventions</w:t>
+      </w:r>
+    </w:p>
+    <w:p>
+      <w:pPr>
+        <w:pStyle w:val="ListParagraph"/>
+        <w:numPr>
+          <w:ilvl w:val="0"/>
+          <w:numId w:val="1"/>
+        </w:numPr>
+      </w:pPr>
+      <w:r>
+        <w:rPr>
+          <w:b/>
+          <w:bCs/>
+          <w:color w:val="0A7227"/>
+        </w:rPr>
+        <w:t xml:space="preserve">✓ </w:t>
+      </w:r>
+      <w:r>
+        <w:t xml:space="preserve">T2. Scaffold monorepo (contracts/, web/, db/, docs/)</w:t>
+      </w:r>
+    </w:p>
+    <w:p>
+      <w:pPr>
+        <w:pStyle w:val="ListParagraph"/>
+        <w:numPr>
+          <w:ilvl w:val="0"/>
+          <w:numId w:val="1"/>
+        </w:numPr>
+      </w:pPr>
+      <w:r>
+        <w:rPr>
+          <w:b/>
+          <w:bCs/>
+          <w:color w:val="0A7227"/>
+        </w:rPr>
+        <w:t xml:space="preserve">✓ </w:t>
+      </w:r>
+      <w:r>
+        <w:t xml:space="preserve">T3. Record architecture decisions (ADR 0001–0003)</w:t>
+      </w:r>
+    </w:p>
+    <w:p>
+      <w:pPr>
+        <w:pStyle w:val="ListParagraph"/>
+        <w:numPr>
+          <w:ilvl w:val="0"/>
+          <w:numId w:val="1"/>
+        </w:numPr>
+      </w:pPr>
+      <w:r>
+        <w:rPr>
+          <w:b/>
+          <w:bCs/>
+          <w:color w:val="0A7227"/>
+        </w:rPr>
+        <w:t xml:space="preserve">✓ </w:t>
+      </w:r>
+      <w:r>
+        <w:t xml:space="preserve">T4. Add quality-gate hooks (tests on save, tests after task)</w:t>
+      </w:r>
+    </w:p>
+    <w:p>
+      <w:pPr>
+        <w:pStyle w:val="ListParagraph"/>
+        <w:numPr>
+          <w:ilvl w:val="0"/>
+          <w:numId w:val="1"/>
+        </w:numPr>
+      </w:pPr>
+      <w:r>
+        <w:rPr>
+          <w:b/>
+          <w:bCs/>
+          <w:color w:val="0A7227"/>
+        </w:rPr>
+        <w:t xml:space="preserve">✓ </w:t>
+      </w:r>
+      <w:r>
+        <w:t xml:space="preserve">T5. Initialise Hardhat contract package</w:t>
+      </w:r>
+    </w:p>
+    <w:p>
+      <w:pPr>
+        <w:pStyle w:val="ListParagraph"/>
+        <w:numPr>
+          <w:ilvl w:val="0"/>
+          <w:numId w:val="1"/>
+        </w:numPr>
+      </w:pPr>
+      <w:r>
+        <w:rPr>
+          <w:b/>
+          <w:bCs/>
+          <w:color w:val="0A7227"/>
+        </w:rPr>
+        <w:t xml:space="preserve">✓ </w:t>
+      </w:r>
+      <w:r>
+        <w:t xml:space="preserve">T6. Write CredentialRegistry smart contract (6 core functions + helpers)</w:t>
+      </w:r>
+    </w:p>
+    <w:p>
+      <w:pPr>
+        <w:pStyle w:val="ListParagraph"/>
+        <w:numPr>
+          <w:ilvl w:val="0"/>
+          <w:numId w:val="1"/>
+        </w:numPr>
+      </w:pPr>
+      <w:r>
+        <w:rPr>
+          <w:b/>
+          <w:bCs/>
+          <w:color w:val="0A7227"/>
+        </w:rPr>
+        <w:t xml:space="preserve">✓ </w:t>
+      </w:r>
+      <w:r>
+        <w:t xml:space="preserve">T7. Write the six acceptance tests + tamper test (7 passing)</w:t>
+      </w:r>
+    </w:p>
+    <w:p>
+      <w:pPr>
+        <w:pStyle w:val="ListParagraph"/>
+        <w:numPr>
+          <w:ilvl w:val="0"/>
+          <w:numId w:val="1"/>
+        </w:numPr>
+      </w:pPr>
+      <w:r>
+        <w:rPr>
+          <w:b/>
+          <w:bCs/>
+          <w:color w:val="0A7227"/>
+        </w:rPr>
+        <w:t xml:space="preserve">✓ </w:t>
+      </w:r>
+      <w:r>
+        <w:t xml:space="preserve">T8. Write deploy script (writes address + ABI)</w:t>
+      </w:r>
+    </w:p>
+    <w:p>
+      <w:pPr>
+        <w:pStyle w:val="ListParagraph"/>
+        <w:numPr>
+          <w:ilvl w:val="0"/>
+          <w:numId w:val="1"/>
+        </w:numPr>
+      </w:pPr>
+      <w:r>
+        <w:rPr>
+          <w:b/>
+          <w:bCs/>
+          <w:color w:val="0A7227"/>
+        </w:rPr>
+        <w:t xml:space="preserve">✓ </w:t>
+      </w:r>
+      <w:r>
+        <w:t xml:space="preserve">T9. Write demo seed script (known-good eligible state)</w:t>
+      </w:r>
+    </w:p>
+    <w:p>
+      <w:pPr>
+        <w:pStyle w:val="ListParagraph"/>
+        <w:numPr>
+          <w:ilvl w:val="0"/>
+          <w:numId w:val="1"/>
+        </w:numPr>
+      </w:pPr>
+      <w:r>
+        <w:rPr>
+          <w:b/>
+          <w:bCs/>
+          <w:color w:val="0A7227"/>
+        </w:rPr>
+        <w:t xml:space="preserve">✓ </w:t>
+      </w:r>
+      <w:r>
+        <w:t xml:space="preserve">T10. Build React + Vite + ethers.js frontend for the core workflow</w:t>
+      </w:r>
+    </w:p>
+    <w:p>
+      <w:pPr>
+        <w:pStyle w:val="ListParagraph"/>
+        <w:numPr>
+          <w:ilvl w:val="0"/>
+          <w:numId w:val="1"/>
+        </w:numPr>
+      </w:pPr>
+      <w:r>
+        <w:rPr>
+          <w:b/>
+          <w:bCs/>
+          <w:color w:val="0A7227"/>
+        </w:rPr>
+        <w:t xml:space="preserve">✓ </w:t>
+      </w:r>
+      <w:r>
+        <w:t xml:space="preserve">T11. Verify full flow end-to-end against a local node</w:t>
+      </w:r>
+    </w:p>
+    <w:p>
+      <w:pPr>
+        <w:pStyle w:val="ListParagraph"/>
+        <w:numPr>
+          <w:ilvl w:val="0"/>
+          <w:numId w:val="1"/>
+        </w:numPr>
+      </w:pPr>
+      <w:r>
+        <w:rPr>
+          <w:b/>
+          <w:bCs/>
+          <w:color w:val="0A7227"/>
+        </w:rPr>
+        <w:t xml:space="preserve">✓ </w:t>
+      </w:r>
+      <w:r>
+        <w:t xml:space="preserve">T12. Write MVP run guide, demo script, presentation outline</w:t>
+      </w:r>
+    </w:p>
+    <w:p>
+      <w:pPr>
+        <w:pStyle w:val="ListParagraph"/>
+        <w:numPr>
+          <w:ilvl w:val="0"/>
+          <w:numId w:val="1"/>
+        </w:numPr>
+      </w:pPr>
+      <w:r>
+        <w:rPr>
+          <w:b/>
+          <w:bCs/>
+          <w:color w:val="0A7227"/>
+        </w:rPr>
+        <w:t xml:space="preserve">✓ </w:t>
+      </w:r>
+      <w:r>
+        <w:t xml:space="preserve">T13. Create living project report (markdown + generated Word doc)</w:t>
+      </w:r>
+    </w:p>
+    <w:p/>
+    <w:p>
+      <w:pPr>
+        <w:pStyle w:val="Heading2"/>
+        <w:spacing w:before="160" w:after="80"/>
+      </w:pPr>
+      <w:r>
+        <w:t xml:space="preserve">To do</w:t>
+      </w:r>
+    </w:p>
+    <w:p/>
+    <w:p>
+      <w:pPr>
+        <w:pStyle w:val="ListParagraph"/>
+        <w:numPr>
+          <w:ilvl w:val="0"/>
+          <w:numId w:val="1"/>
+        </w:numPr>
+      </w:pPr>
+      <w:r>
+        <w:rPr>
+          <w:b/>
+          <w:bCs/>
+          <w:color w:val="B4232C"/>
+        </w:rPr>
+        <w:t xml:space="preserve">☐ </w:t>
+      </w:r>
+      <w:r>
+        <w:t xml:space="preserve">T14. </w:t>
+      </w:r>
+      <w:r>
+        <w:rPr>
+          <w:b/>
+          <w:bCs/>
+        </w:rPr>
+        <w:t xml:space="preserve">Business validation</w:t>
+      </w:r>
+      <w:r>
+        <w:t xml:space="preserve"> (S2) — confirm the pain or lock the reframe,</w:t>
+      </w:r>
+    </w:p>
+    <w:p>
+      <w:r>
+        <w:t xml:space="preserve">      by end of Day 2. Owner: Person 5 + 1. See </w:t>
+      </w:r>
+      <w:r>
+        <w:rPr>
+          <w:sz w:val="20"/>
+          <w:szCs w:val="20"/>
+          <w:rFonts w:ascii="Consolas" w:cs="Consolas" w:eastAsia="Consolas" w:hAnsi="Consolas"/>
+        </w:rPr>
+        <w:t xml:space="preserve">docs/business-validation.md</w:t>
+      </w:r>
+      <w:r>
+        <w:t xml:space="preserve">.</w:t>
+      </w:r>
+    </w:p>
+    <w:p>
+      <w:pPr>
+        <w:pStyle w:val="ListParagraph"/>
+        <w:numPr>
+          <w:ilvl w:val="0"/>
+          <w:numId w:val="1"/>
+        </w:numPr>
+      </w:pPr>
+      <w:r>
+        <w:rPr>
+          <w:b/>
+          <w:bCs/>
+          <w:color w:val="B4232C"/>
+        </w:rPr>
+        <w:t xml:space="preserve">☐ </w:t>
+      </w:r>
+      <w:r>
+        <w:t xml:space="preserve">T15. Add a single </w:t>
+      </w:r>
+      <w:r>
+        <w:rPr>
+          <w:sz w:val="20"/>
+          <w:szCs w:val="20"/>
+          <w:rFonts w:ascii="Consolas" w:cs="Consolas" w:eastAsia="Consolas" w:hAnsi="Consolas"/>
+        </w:rPr>
+        <w:t xml:space="preserve">npm run reset</w:t>
+      </w:r>
+      <w:r>
+        <w:t xml:space="preserve"> convenience for the demo (deploy + seed)</w:t>
+      </w:r>
+    </w:p>
+    <w:p>
+      <w:pPr>
+        <w:pStyle w:val="ListParagraph"/>
+        <w:numPr>
+          <w:ilvl w:val="0"/>
+          <w:numId w:val="1"/>
+        </w:numPr>
+      </w:pPr>
+      <w:r>
+        <w:rPr>
+          <w:b/>
+          <w:bCs/>
+          <w:color w:val="B4232C"/>
+        </w:rPr>
+        <w:t xml:space="preserve">☐ </w:t>
+      </w:r>
+      <w:r>
+        <w:t xml:space="preserve">T16. Wire the UI to Supabase for off-chain metadata (schema in </w:t>
+      </w:r>
+      <w:r>
+        <w:rPr>
+          <w:sz w:val="20"/>
+          <w:szCs w:val="20"/>
+          <w:rFonts w:ascii="Consolas" w:cs="Consolas" w:eastAsia="Consolas" w:hAnsi="Consolas"/>
+        </w:rPr>
+        <w:t xml:space="preserve">db/schema.sql</w:t>
+      </w:r>
+      <w:r>
+        <w:t xml:space="preserve">)</w:t>
+      </w:r>
+    </w:p>
+    <w:p>
+      <w:pPr>
+        <w:pStyle w:val="ListParagraph"/>
+        <w:numPr>
+          <w:ilvl w:val="0"/>
+          <w:numId w:val="1"/>
+        </w:numPr>
+      </w:pPr>
+      <w:r>
+        <w:rPr>
+          <w:b/>
+          <w:bCs/>
+          <w:color w:val="B4232C"/>
+        </w:rPr>
+        <w:t xml:space="preserve">☐ </w:t>
+      </w:r>
+      <w:r>
+        <w:t xml:space="preserve">T17. Document upload + SHA-256 hashing from the UI (contract support exists)</w:t>
+      </w:r>
+    </w:p>
+    <w:p>
+      <w:pPr>
+        <w:pStyle w:val="ListParagraph"/>
+        <w:numPr>
+          <w:ilvl w:val="0"/>
+          <w:numId w:val="1"/>
+        </w:numPr>
+      </w:pPr>
+      <w:r>
+        <w:rPr>
+          <w:b/>
+          <w:bCs/>
+          <w:color w:val="B4232C"/>
+        </w:rPr>
+        <w:t xml:space="preserve">☐ </w:t>
+      </w:r>
+      <w:r>
+        <w:t xml:space="preserve">T18. Issuer/contractor dashboards to create credentials &amp; activities from the UI</w:t>
+      </w:r>
+    </w:p>
+    <w:p>
+      <w:pPr>
+        <w:pStyle w:val="ListParagraph"/>
+        <w:numPr>
+          <w:ilvl w:val="0"/>
+          <w:numId w:val="1"/>
+        </w:numPr>
+      </w:pPr>
+      <w:r>
+        <w:rPr>
+          <w:b/>
+          <w:bCs/>
+          <w:color w:val="B4232C"/>
+        </w:rPr>
+        <w:t xml:space="preserve">☐ </w:t>
+      </w:r>
+      <w:r>
+        <w:t xml:space="preserve">T19. Tamper-detection screen in the UI</w:t>
+      </w:r>
+    </w:p>
+    <w:p>
+      <w:pPr>
+        <w:pStyle w:val="ListParagraph"/>
+        <w:numPr>
+          <w:ilvl w:val="0"/>
+          <w:numId w:val="1"/>
+        </w:numPr>
+      </w:pPr>
+      <w:r>
+        <w:rPr>
+          <w:b/>
+          <w:bCs/>
+          <w:color w:val="B4232C"/>
+        </w:rPr>
+        <w:t xml:space="preserve">☐ </w:t>
+      </w:r>
+      <w:r>
+        <w:t xml:space="preserve">T20. (Optional) MetaMask wallet signing instead of local dev keys</w:t>
+      </w:r>
+    </w:p>
+    <w:p>
+      <w:pPr>
+        <w:pStyle w:val="ListParagraph"/>
+        <w:numPr>
+          <w:ilvl w:val="0"/>
+          <w:numId w:val="1"/>
+        </w:numPr>
+      </w:pPr>
+      <w:r>
+        <w:rPr>
+          <w:b/>
+          <w:bCs/>
+          <w:color w:val="B4232C"/>
+        </w:rPr>
+        <w:t xml:space="preserve">☐ </w:t>
+      </w:r>
+      <w:r>
+        <w:t xml:space="preserve">T21. (Optional) Add Tailwind styling (currently plain CSS — ADR 0003)</w:t>
+      </w:r>
+    </w:p>
+    <w:p>
+      <w:pPr>
+        <w:pStyle w:val="ListParagraph"/>
+        <w:numPr>
+          <w:ilvl w:val="0"/>
+          <w:numId w:val="1"/>
+        </w:numPr>
+      </w:pPr>
+      <w:r>
+        <w:rPr>
+          <w:b/>
+          <w:bCs/>
+          <w:color w:val="B4232C"/>
+        </w:rPr>
+        <w:t xml:space="preserve">☐ </w:t>
+      </w:r>
+      <w:r>
+        <w:t xml:space="preserve">T22. Record a clean demo video as a fallback (Day 11)</w:t>
+      </w:r>
+    </w:p>
+    <w:p>
+      <w:pPr>
+        <w:pStyle w:val="ListParagraph"/>
+        <w:numPr>
+          <w:ilvl w:val="0"/>
+          <w:numId w:val="1"/>
+        </w:numPr>
+      </w:pPr>
+      <w:r>
+        <w:rPr>
+          <w:b/>
+          <w:bCs/>
+          <w:color w:val="B4232C"/>
+        </w:rPr>
+        <w:t xml:space="preserve">☐ </w:t>
+      </w:r>
+      <w:r>
+        <w:t xml:space="preserve">T23. Build presentation slides from </w:t>
+      </w:r>
+      <w:r>
+        <w:rPr>
+          <w:sz w:val="20"/>
+          <w:szCs w:val="20"/>
+          <w:rFonts w:ascii="Consolas" w:cs="Consolas" w:eastAsia="Consolas" w:hAnsi="Consolas"/>
+        </w:rPr>
+        <w:t xml:space="preserve">docs/presentation-outline.md</w:t>
+      </w:r>
+    </w:p>
+    <w:p>
+      <w:pPr>
+        <w:pStyle w:val="ListParagraph"/>
+        <w:numPr>
+          <w:ilvl w:val="0"/>
+          <w:numId w:val="1"/>
+        </w:numPr>
+      </w:pPr>
+      <w:r>
+        <w:rPr>
+          <w:b/>
+          <w:bCs/>
+          <w:color w:val="B4232C"/>
+        </w:rPr>
+        <w:t xml:space="preserve">☐ </w:t>
+      </w:r>
+      <w:r>
+        <w:t xml:space="preserve">T24. Rehearse the demo end-to-end (Day 13)</w:t>
+      </w:r>
+    </w:p>
+    <w:p>
+      <w:pPr>
+        <w:pStyle w:val="ListParagraph"/>
+        <w:numPr>
+          <w:ilvl w:val="0"/>
+          <w:numId w:val="1"/>
+        </w:numPr>
+      </w:pPr>
+      <w:r>
+        <w:rPr>
+          <w:b/>
+          <w:bCs/>
+          <w:color w:val="B4232C"/>
+        </w:rPr>
+        <w:t xml:space="preserve">☐ </w:t>
+      </w:r>
+      <w:r>
+        <w:t xml:space="preserve">T25. Set a real git author identity for the team before shared pushing</w:t>
+      </w:r>
+    </w:p>
+    <w:p/>
+    <w:p>
+      <w:r>
+        <w:t xml:space="preserve">Owner column (optional): add names next to tasks as the team divides work.</w:t>
+      </w:r>
+    </w:p>
+    <w:p/>
+    <w:p>
+      <w:pPr>
+        <w:pBdr>
+          <w:bottom w:val="single" w:color="DDDDDD" w:sz="6"/>
+        </w:pBdr>
+      </w:pPr>
+    </w:p>
+    <w:p/>
+    <w:p>
+      <w:pPr>
+        <w:pStyle w:val="Heading1"/>
+        <w:spacing w:before="160" w:after="80"/>
+      </w:pPr>
+      <w:r>
+        <w:t xml:space="preserve">5. Tech stack (actual installed versions)</w:t>
       </w:r>
     </w:p>
     <w:p/>
@@ -1778,132 +2415,374 @@
           </w:tcPr>
           <w:p>
             <w:r/>
-            <w:r/>
-          </w:p>
-        </w:tc>
-      </w:tr>
-      <w:tr>
-        <w:tc>
-          <w:tcPr>
-            <w:tcBorders>
-              <w:top w:val="single" w:color="CCCCCC" w:sz="1"/>
-              <w:left w:val="single" w:color="CCCCCC" w:sz="1"/>
-              <w:bottom w:val="single" w:color="CCCCCC" w:sz="1"/>
-              <w:right w:val="single" w:color="CCCCCC" w:sz="1"/>
-            </w:tcBorders>
-          </w:tcPr>
-          <w:p>
-            <w:r/>
-          </w:p>
-        </w:tc>
-        <w:tc>
-          <w:tcPr>
-            <w:tcBorders>
-              <w:top w:val="single" w:color="CCCCCC" w:sz="1"/>
-              <w:left w:val="single" w:color="CCCCCC" w:sz="1"/>
-              <w:bottom w:val="single" w:color="CCCCCC" w:sz="1"/>
-              <w:right w:val="single" w:color="CCCCCC" w:sz="1"/>
-            </w:tcBorders>
-          </w:tcPr>
-          <w:p>
-            <w:r/>
-          </w:p>
-        </w:tc>
-        <w:tc>
-          <w:tcPr>
-            <w:tcBorders>
-              <w:top w:val="single" w:color="CCCCCC" w:sz="1"/>
-              <w:left w:val="single" w:color="CCCCCC" w:sz="1"/>
-              <w:bottom w:val="single" w:color="CCCCCC" w:sz="1"/>
-              <w:right w:val="single" w:color="CCCCCC" w:sz="1"/>
-            </w:tcBorders>
-          </w:tcPr>
-          <w:p>
-            <w:r/>
-            <w:r/>
-            <w:r/>
-          </w:p>
-        </w:tc>
-      </w:tr>
-      <w:tr>
-        <w:tc>
-          <w:tcPr>
-            <w:tcBorders>
-              <w:top w:val="single" w:color="CCCCCC" w:sz="1"/>
-              <w:left w:val="single" w:color="CCCCCC" w:sz="1"/>
-              <w:bottom w:val="single" w:color="CCCCCC" w:sz="1"/>
-              <w:right w:val="single" w:color="CCCCCC" w:sz="1"/>
-            </w:tcBorders>
-          </w:tcPr>
-          <w:p>
-            <w:r/>
-          </w:p>
-        </w:tc>
-        <w:tc>
-          <w:tcPr>
-            <w:tcBorders>
-              <w:top w:val="single" w:color="CCCCCC" w:sz="1"/>
-              <w:left w:val="single" w:color="CCCCCC" w:sz="1"/>
-              <w:bottom w:val="single" w:color="CCCCCC" w:sz="1"/>
-              <w:right w:val="single" w:color="CCCCCC" w:sz="1"/>
-            </w:tcBorders>
-          </w:tcPr>
-          <w:p>
-            <w:r/>
-          </w:p>
-        </w:tc>
-        <w:tc>
-          <w:tcPr>
-            <w:tcBorders>
-              <w:top w:val="single" w:color="CCCCCC" w:sz="1"/>
-              <w:left w:val="single" w:color="CCCCCC" w:sz="1"/>
-              <w:bottom w:val="single" w:color="CCCCCC" w:sz="1"/>
-              <w:right w:val="single" w:color="CCCCCC" w:sz="1"/>
-            </w:tcBorders>
-          </w:tcPr>
-          <w:p>
-            <w:r/>
-          </w:p>
-        </w:tc>
-      </w:tr>
-      <w:tr>
-        <w:tc>
-          <w:tcPr>
-            <w:tcBorders>
-              <w:top w:val="single" w:color="CCCCCC" w:sz="1"/>
-              <w:left w:val="single" w:color="CCCCCC" w:sz="1"/>
-              <w:bottom w:val="single" w:color="CCCCCC" w:sz="1"/>
-              <w:right w:val="single" w:color="CCCCCC" w:sz="1"/>
-            </w:tcBorders>
-          </w:tcPr>
-          <w:p>
-            <w:r/>
-          </w:p>
-        </w:tc>
-        <w:tc>
-          <w:tcPr>
-            <w:tcBorders>
-              <w:top w:val="single" w:color="CCCCCC" w:sz="1"/>
-              <w:left w:val="single" w:color="CCCCCC" w:sz="1"/>
-              <w:bottom w:val="single" w:color="CCCCCC" w:sz="1"/>
-              <w:right w:val="single" w:color="CCCCCC" w:sz="1"/>
-            </w:tcBorders>
-          </w:tcPr>
-          <w:p>
-            <w:r/>
-          </w:p>
-        </w:tc>
-        <w:tc>
-          <w:tcPr>
-            <w:tcBorders>
-              <w:top w:val="single" w:color="CCCCCC" w:sz="1"/>
-              <w:left w:val="single" w:color="CCCCCC" w:sz="1"/>
-              <w:bottom w:val="single" w:color="CCCCCC" w:sz="1"/>
-              <w:right w:val="single" w:color="CCCCCC" w:sz="1"/>
-            </w:tcBorders>
-          </w:tcPr>
-          <w:p>
-            <w:r/>
+          </w:p>
+        </w:tc>
+      </w:tr>
+      <w:tr>
+        <w:tc>
+          <w:tcPr>
+            <w:tcBorders>
+              <w:top w:val="single" w:color="CCCCCC" w:sz="1"/>
+              <w:left w:val="single" w:color="CCCCCC" w:sz="1"/>
+              <w:bottom w:val="single" w:color="CCCCCC" w:sz="1"/>
+              <w:right w:val="single" w:color="CCCCCC" w:sz="1"/>
+            </w:tcBorders>
+          </w:tcPr>
+          <w:p>
+            <w:r/>
+          </w:p>
+        </w:tc>
+        <w:tc>
+          <w:tcPr>
+            <w:tcBorders>
+              <w:top w:val="single" w:color="CCCCCC" w:sz="1"/>
+              <w:left w:val="single" w:color="CCCCCC" w:sz="1"/>
+              <w:bottom w:val="single" w:color="CCCCCC" w:sz="1"/>
+              <w:right w:val="single" w:color="CCCCCC" w:sz="1"/>
+            </w:tcBorders>
+          </w:tcPr>
+          <w:p>
+            <w:r/>
+          </w:p>
+        </w:tc>
+        <w:tc>
+          <w:tcPr>
+            <w:tcBorders>
+              <w:top w:val="single" w:color="CCCCCC" w:sz="1"/>
+              <w:left w:val="single" w:color="CCCCCC" w:sz="1"/>
+              <w:bottom w:val="single" w:color="CCCCCC" w:sz="1"/>
+              <w:right w:val="single" w:color="CCCCCC" w:sz="1"/>
+            </w:tcBorders>
+          </w:tcPr>
+          <w:p>
+            <w:r/>
+          </w:p>
+        </w:tc>
+      </w:tr>
+      <w:tr>
+        <w:tc>
+          <w:tcPr>
+            <w:tcBorders>
+              <w:top w:val="single" w:color="CCCCCC" w:sz="1"/>
+              <w:left w:val="single" w:color="CCCCCC" w:sz="1"/>
+              <w:bottom w:val="single" w:color="CCCCCC" w:sz="1"/>
+              <w:right w:val="single" w:color="CCCCCC" w:sz="1"/>
+            </w:tcBorders>
+          </w:tcPr>
+          <w:p>
+            <w:r/>
+          </w:p>
+        </w:tc>
+        <w:tc>
+          <w:tcPr>
+            <w:tcBorders>
+              <w:top w:val="single" w:color="CCCCCC" w:sz="1"/>
+              <w:left w:val="single" w:color="CCCCCC" w:sz="1"/>
+              <w:bottom w:val="single" w:color="CCCCCC" w:sz="1"/>
+              <w:right w:val="single" w:color="CCCCCC" w:sz="1"/>
+            </w:tcBorders>
+          </w:tcPr>
+          <w:p>
+            <w:r/>
+          </w:p>
+        </w:tc>
+        <w:tc>
+          <w:tcPr>
+            <w:tcBorders>
+              <w:top w:val="single" w:color="CCCCCC" w:sz="1"/>
+              <w:left w:val="single" w:color="CCCCCC" w:sz="1"/>
+              <w:bottom w:val="single" w:color="CCCCCC" w:sz="1"/>
+              <w:right w:val="single" w:color="CCCCCC" w:sz="1"/>
+            </w:tcBorders>
+          </w:tcPr>
+          <w:p>
+            <w:r/>
+          </w:p>
+        </w:tc>
+      </w:tr>
+      <w:tr>
+        <w:tc>
+          <w:tcPr>
+            <w:tcBorders>
+              <w:top w:val="single" w:color="CCCCCC" w:sz="1"/>
+              <w:left w:val="single" w:color="CCCCCC" w:sz="1"/>
+              <w:bottom w:val="single" w:color="CCCCCC" w:sz="1"/>
+              <w:right w:val="single" w:color="CCCCCC" w:sz="1"/>
+            </w:tcBorders>
+          </w:tcPr>
+          <w:p>
+            <w:r/>
+          </w:p>
+        </w:tc>
+        <w:tc>
+          <w:tcPr>
+            <w:tcBorders>
+              <w:top w:val="single" w:color="CCCCCC" w:sz="1"/>
+              <w:left w:val="single" w:color="CCCCCC" w:sz="1"/>
+              <w:bottom w:val="single" w:color="CCCCCC" w:sz="1"/>
+              <w:right w:val="single" w:color="CCCCCC" w:sz="1"/>
+            </w:tcBorders>
+          </w:tcPr>
+          <w:p>
+            <w:r/>
+          </w:p>
+        </w:tc>
+        <w:tc>
+          <w:tcPr>
+            <w:tcBorders>
+              <w:top w:val="single" w:color="CCCCCC" w:sz="1"/>
+              <w:left w:val="single" w:color="CCCCCC" w:sz="1"/>
+              <w:bottom w:val="single" w:color="CCCCCC" w:sz="1"/>
+              <w:right w:val="single" w:color="CCCCCC" w:sz="1"/>
+            </w:tcBorders>
+          </w:tcPr>
+          <w:p>
+            <w:r/>
+          </w:p>
+        </w:tc>
+      </w:tr>
+      <w:tr>
+        <w:tc>
+          <w:tcPr>
+            <w:tcBorders>
+              <w:top w:val="single" w:color="CCCCCC" w:sz="1"/>
+              <w:left w:val="single" w:color="CCCCCC" w:sz="1"/>
+              <w:bottom w:val="single" w:color="CCCCCC" w:sz="1"/>
+              <w:right w:val="single" w:color="CCCCCC" w:sz="1"/>
+            </w:tcBorders>
+          </w:tcPr>
+          <w:p>
+            <w:r/>
+          </w:p>
+        </w:tc>
+        <w:tc>
+          <w:tcPr>
+            <w:tcBorders>
+              <w:top w:val="single" w:color="CCCCCC" w:sz="1"/>
+              <w:left w:val="single" w:color="CCCCCC" w:sz="1"/>
+              <w:bottom w:val="single" w:color="CCCCCC" w:sz="1"/>
+              <w:right w:val="single" w:color="CCCCCC" w:sz="1"/>
+            </w:tcBorders>
+          </w:tcPr>
+          <w:p>
+            <w:r/>
+          </w:p>
+        </w:tc>
+        <w:tc>
+          <w:tcPr>
+            <w:tcBorders>
+              <w:top w:val="single" w:color="CCCCCC" w:sz="1"/>
+              <w:left w:val="single" w:color="CCCCCC" w:sz="1"/>
+              <w:bottom w:val="single" w:color="CCCCCC" w:sz="1"/>
+              <w:right w:val="single" w:color="CCCCCC" w:sz="1"/>
+            </w:tcBorders>
+          </w:tcPr>
+          <w:p>
+            <w:r/>
+          </w:p>
+        </w:tc>
+      </w:tr>
+      <w:tr>
+        <w:tc>
+          <w:tcPr>
+            <w:tcBorders>
+              <w:top w:val="single" w:color="CCCCCC" w:sz="1"/>
+              <w:left w:val="single" w:color="CCCCCC" w:sz="1"/>
+              <w:bottom w:val="single" w:color="CCCCCC" w:sz="1"/>
+              <w:right w:val="single" w:color="CCCCCC" w:sz="1"/>
+            </w:tcBorders>
+          </w:tcPr>
+          <w:p>
+            <w:r/>
+          </w:p>
+        </w:tc>
+        <w:tc>
+          <w:tcPr>
+            <w:tcBorders>
+              <w:top w:val="single" w:color="CCCCCC" w:sz="1"/>
+              <w:left w:val="single" w:color="CCCCCC" w:sz="1"/>
+              <w:bottom w:val="single" w:color="CCCCCC" w:sz="1"/>
+              <w:right w:val="single" w:color="CCCCCC" w:sz="1"/>
+            </w:tcBorders>
+          </w:tcPr>
+          <w:p>
+            <w:r/>
+          </w:p>
+        </w:tc>
+        <w:tc>
+          <w:tcPr>
+            <w:tcBorders>
+              <w:top w:val="single" w:color="CCCCCC" w:sz="1"/>
+              <w:left w:val="single" w:color="CCCCCC" w:sz="1"/>
+              <w:bottom w:val="single" w:color="CCCCCC" w:sz="1"/>
+              <w:right w:val="single" w:color="CCCCCC" w:sz="1"/>
+            </w:tcBorders>
+          </w:tcPr>
+          <w:p>
+            <w:r/>
+          </w:p>
+        </w:tc>
+      </w:tr>
+      <w:tr>
+        <w:tc>
+          <w:tcPr>
+            <w:tcBorders>
+              <w:top w:val="single" w:color="CCCCCC" w:sz="1"/>
+              <w:left w:val="single" w:color="CCCCCC" w:sz="1"/>
+              <w:bottom w:val="single" w:color="CCCCCC" w:sz="1"/>
+              <w:right w:val="single" w:color="CCCCCC" w:sz="1"/>
+            </w:tcBorders>
+          </w:tcPr>
+          <w:p>
+            <w:r/>
+          </w:p>
+        </w:tc>
+        <w:tc>
+          <w:tcPr>
+            <w:tcBorders>
+              <w:top w:val="single" w:color="CCCCCC" w:sz="1"/>
+              <w:left w:val="single" w:color="CCCCCC" w:sz="1"/>
+              <w:bottom w:val="single" w:color="CCCCCC" w:sz="1"/>
+              <w:right w:val="single" w:color="CCCCCC" w:sz="1"/>
+            </w:tcBorders>
+          </w:tcPr>
+          <w:p>
+            <w:r/>
+          </w:p>
+        </w:tc>
+        <w:tc>
+          <w:tcPr>
+            <w:tcBorders>
+              <w:top w:val="single" w:color="CCCCCC" w:sz="1"/>
+              <w:left w:val="single" w:color="CCCCCC" w:sz="1"/>
+              <w:bottom w:val="single" w:color="CCCCCC" w:sz="1"/>
+              <w:right w:val="single" w:color="CCCCCC" w:sz="1"/>
+            </w:tcBorders>
+          </w:tcPr>
+          <w:p>
+            <w:r/>
+          </w:p>
+        </w:tc>
+      </w:tr>
+      <w:tr>
+        <w:tc>
+          <w:tcPr>
+            <w:tcBorders>
+              <w:top w:val="single" w:color="CCCCCC" w:sz="1"/>
+              <w:left w:val="single" w:color="CCCCCC" w:sz="1"/>
+              <w:bottom w:val="single" w:color="CCCCCC" w:sz="1"/>
+              <w:right w:val="single" w:color="CCCCCC" w:sz="1"/>
+            </w:tcBorders>
+          </w:tcPr>
+          <w:p>
+            <w:r/>
+          </w:p>
+        </w:tc>
+        <w:tc>
+          <w:tcPr>
+            <w:tcBorders>
+              <w:top w:val="single" w:color="CCCCCC" w:sz="1"/>
+              <w:left w:val="single" w:color="CCCCCC" w:sz="1"/>
+              <w:bottom w:val="single" w:color="CCCCCC" w:sz="1"/>
+              <w:right w:val="single" w:color="CCCCCC" w:sz="1"/>
+            </w:tcBorders>
+          </w:tcPr>
+          <w:p>
+            <w:r/>
+          </w:p>
+        </w:tc>
+        <w:tc>
+          <w:tcPr>
+            <w:tcBorders>
+              <w:top w:val="single" w:color="CCCCCC" w:sz="1"/>
+              <w:left w:val="single" w:color="CCCCCC" w:sz="1"/>
+              <w:bottom w:val="single" w:color="CCCCCC" w:sz="1"/>
+              <w:right w:val="single" w:color="CCCCCC" w:sz="1"/>
+            </w:tcBorders>
+          </w:tcPr>
+          <w:p>
+            <w:r/>
+          </w:p>
+        </w:tc>
+      </w:tr>
+      <w:tr>
+        <w:tc>
+          <w:tcPr>
+            <w:tcBorders>
+              <w:top w:val="single" w:color="CCCCCC" w:sz="1"/>
+              <w:left w:val="single" w:color="CCCCCC" w:sz="1"/>
+              <w:bottom w:val="single" w:color="CCCCCC" w:sz="1"/>
+              <w:right w:val="single" w:color="CCCCCC" w:sz="1"/>
+            </w:tcBorders>
+          </w:tcPr>
+          <w:p>
+            <w:r/>
+          </w:p>
+        </w:tc>
+        <w:tc>
+          <w:tcPr>
+            <w:tcBorders>
+              <w:top w:val="single" w:color="CCCCCC" w:sz="1"/>
+              <w:left w:val="single" w:color="CCCCCC" w:sz="1"/>
+              <w:bottom w:val="single" w:color="CCCCCC" w:sz="1"/>
+              <w:right w:val="single" w:color="CCCCCC" w:sz="1"/>
+            </w:tcBorders>
+          </w:tcPr>
+          <w:p>
+            <w:r/>
+          </w:p>
+        </w:tc>
+        <w:tc>
+          <w:tcPr>
+            <w:tcBorders>
+              <w:top w:val="single" w:color="CCCCCC" w:sz="1"/>
+              <w:left w:val="single" w:color="CCCCCC" w:sz="1"/>
+              <w:bottom w:val="single" w:color="CCCCCC" w:sz="1"/>
+              <w:right w:val="single" w:color="CCCCCC" w:sz="1"/>
+            </w:tcBorders>
+          </w:tcPr>
+          <w:p>
+            <w:r/>
+          </w:p>
+        </w:tc>
+      </w:tr>
+      <w:tr>
+        <w:tc>
+          <w:tcPr>
+            <w:tcBorders>
+              <w:top w:val="single" w:color="CCCCCC" w:sz="1"/>
+              <w:left w:val="single" w:color="CCCCCC" w:sz="1"/>
+              <w:bottom w:val="single" w:color="CCCCCC" w:sz="1"/>
+              <w:right w:val="single" w:color="CCCCCC" w:sz="1"/>
+            </w:tcBorders>
+          </w:tcPr>
+          <w:p>
+            <w:r/>
+          </w:p>
+        </w:tc>
+        <w:tc>
+          <w:tcPr>
+            <w:tcBorders>
+              <w:top w:val="single" w:color="CCCCCC" w:sz="1"/>
+              <w:left w:val="single" w:color="CCCCCC" w:sz="1"/>
+              <w:bottom w:val="single" w:color="CCCCCC" w:sz="1"/>
+              <w:right w:val="single" w:color="CCCCCC" w:sz="1"/>
+            </w:tcBorders>
+          </w:tcPr>
+          <w:p>
+            <w:r/>
+          </w:p>
+        </w:tc>
+        <w:tc>
+          <w:tcPr>
+            <w:tcBorders>
+              <w:top w:val="single" w:color="CCCCCC" w:sz="1"/>
+              <w:left w:val="single" w:color="CCCCCC" w:sz="1"/>
+              <w:bottom w:val="single" w:color="CCCCCC" w:sz="1"/>
+              <w:right w:val="single" w:color="CCCCCC" w:sz="1"/>
+            </w:tcBorders>
+          </w:tcPr>
+          <w:p>
             <w:r/>
           </w:p>
         </w:tc>
@@ -2007,128 +2886,1204 @@
         <w:spacing w:before="160" w:after="80"/>
       </w:pPr>
       <w:r>
-        <w:t xml:space="preserve">5. Scope boundaries (explicitly NOT built)</w:t>
-      </w:r>
-    </w:p>
-    <w:p/>
-    <w:p>
-      <w:r>
-        <w:t xml:space="preserve">Out of scope for this 15-day part-time proof-of-concept:</w:t>
-      </w:r>
-    </w:p>
-    <w:p/>
-    <w:p>
-      <w:pPr>
-        <w:pStyle w:val="ListParagraph"/>
-        <w:numPr>
-          <w:ilvl w:val="0"/>
-          <w:numId w:val="1"/>
-        </w:numPr>
-      </w:pPr>
-      <w:r>
-        <w:t xml:space="preserve">Real MOM / LTA / BCA / Hubble API integration</w:t>
-      </w:r>
-    </w:p>
-    <w:p>
-      <w:pPr>
-        <w:pStyle w:val="ListParagraph"/>
-        <w:numPr>
-          <w:ilvl w:val="0"/>
-          <w:numId w:val="1"/>
-        </w:numPr>
-      </w:pPr>
-      <w:r>
-        <w:t xml:space="preserve">Real government credential verification</w:t>
-      </w:r>
-    </w:p>
-    <w:p>
-      <w:pPr>
-        <w:pStyle w:val="ListParagraph"/>
-        <w:numPr>
-          <w:ilvl w:val="0"/>
-          <w:numId w:val="1"/>
-        </w:numPr>
-      </w:pPr>
-      <w:r>
-        <w:t xml:space="preserve">NRIC or any real personal data (placeholders only)</w:t>
-      </w:r>
-    </w:p>
-    <w:p>
-      <w:pPr>
-        <w:pStyle w:val="ListParagraph"/>
-        <w:numPr>
-          <w:ilvl w:val="0"/>
-          <w:numId w:val="1"/>
-        </w:numPr>
-      </w:pPr>
-      <w:r>
-        <w:t xml:space="preserve">Mobile app</w:t>
-      </w:r>
-    </w:p>
-    <w:p>
-      <w:pPr>
-        <w:pStyle w:val="ListParagraph"/>
-        <w:numPr>
-          <w:ilvl w:val="0"/>
-          <w:numId w:val="1"/>
-        </w:numPr>
-      </w:pPr>
-      <w:r>
-        <w:t xml:space="preserve">Tokens, NFTs, cryptocurrency, payments</w:t>
-      </w:r>
-    </w:p>
-    <w:p>
-      <w:pPr>
-        <w:pStyle w:val="ListParagraph"/>
-        <w:numPr>
-          <w:ilvl w:val="0"/>
-          <w:numId w:val="1"/>
-        </w:numPr>
-      </w:pPr>
-      <w:r>
-        <w:t xml:space="preserve">AI, IoT</w:t>
-      </w:r>
-    </w:p>
-    <w:p>
-      <w:pPr>
-        <w:pStyle w:val="ListParagraph"/>
-        <w:numPr>
-          <w:ilvl w:val="0"/>
-          <w:numId w:val="1"/>
-        </w:numPr>
-      </w:pPr>
-      <w:r>
-        <w:t xml:space="preserve">A full PTW system or full WSH management system</w:t>
-      </w:r>
-    </w:p>
-    <w:p>
-      <w:pPr>
-        <w:pStyle w:val="ListParagraph"/>
-        <w:numPr>
-          <w:ilvl w:val="0"/>
-          <w:numId w:val="1"/>
-        </w:numPr>
-      </w:pPr>
-      <w:r>
-        <w:t xml:space="preserve">More than ~15 UI screens or more than ~6 core contract functions</w:t>
-      </w:r>
-    </w:p>
-    <w:p/>
-    <w:p>
-      <w:r>
-        <w:t xml:space="preserve">Site-specific checks (lifting plan, crane position, ground condition, weather,</w:t>
-      </w:r>
-    </w:p>
-    <w:p>
-      <w:r>
-        <w:t xml:space="preserve">risk assessment, toolbox briefing, physical inspection, final PTW approval) stay</w:t>
-      </w:r>
-    </w:p>
-    <w:p>
-      <w:r>
-        <w:t xml:space="preserve">in the e-PTW system and are out of scope for the blockchain layer.</w:t>
-      </w:r>
-    </w:p>
+        <w:t xml:space="preserve">6. Features</w:t>
+      </w:r>
+    </w:p>
+    <w:p/>
+    <w:p>
+      <w:pPr>
+        <w:pStyle w:val="Heading2"/>
+        <w:spacing w:before="160" w:after="80"/>
+      </w:pPr>
+      <w:r>
+        <w:t xml:space="preserve">Implemented (working in the MVP)</w:t>
+      </w:r>
+    </w:p>
+    <w:p/>
+    <w:tbl>
+      <w:tblPr>
+        <w:tblW w:type="pct" w:w="100%"/>
+        <w:tblBorders>
+          <w:top w:val="single" w:color="auto" w:sz="4"/>
+          <w:left w:val="single" w:color="auto" w:sz="4"/>
+          <w:bottom w:val="single" w:color="auto" w:sz="4"/>
+          <w:right w:val="single" w:color="auto" w:sz="4"/>
+          <w:insideH w:val="single" w:color="auto" w:sz="4"/>
+          <w:insideV w:val="single" w:color="auto" w:sz="4"/>
+        </w:tblBorders>
+      </w:tblPr>
+      <w:tblGrid>
+        <w:gridCol w:w="100"/>
+        <w:gridCol w:w="100"/>
+        <w:gridCol w:w="100"/>
+        <w:gridCol w:w="100"/>
+      </w:tblGrid>
+      <w:tr>
+        <w:tc>
+          <w:tcPr>
+            <w:tcBorders>
+              <w:top w:val="single" w:color="CCCCCC" w:sz="1"/>
+              <w:left w:val="single" w:color="CCCCCC" w:sz="1"/>
+              <w:bottom w:val="single" w:color="CCCCCC" w:sz="1"/>
+              <w:right w:val="single" w:color="CCCCCC" w:sz="1"/>
+            </w:tcBorders>
+            <w:shd w:fill="F0F2F5"/>
+          </w:tcPr>
+          <w:p>
+            <w:r>
+              <w:rPr>
+                <w:b/>
+                <w:bCs/>
+              </w:rPr>
+            </w:r>
+          </w:p>
+        </w:tc>
+        <w:tc>
+          <w:tcPr>
+            <w:tcBorders>
+              <w:top w:val="single" w:color="CCCCCC" w:sz="1"/>
+              <w:left w:val="single" w:color="CCCCCC" w:sz="1"/>
+              <w:bottom w:val="single" w:color="CCCCCC" w:sz="1"/>
+              <w:right w:val="single" w:color="CCCCCC" w:sz="1"/>
+            </w:tcBorders>
+            <w:shd w:fill="F0F2F5"/>
+          </w:tcPr>
+          <w:p>
+            <w:r>
+              <w:rPr>
+                <w:b/>
+                <w:bCs/>
+              </w:rPr>
+            </w:r>
+          </w:p>
+        </w:tc>
+        <w:tc>
+          <w:tcPr>
+            <w:tcBorders>
+              <w:top w:val="single" w:color="CCCCCC" w:sz="1"/>
+              <w:left w:val="single" w:color="CCCCCC" w:sz="1"/>
+              <w:bottom w:val="single" w:color="CCCCCC" w:sz="1"/>
+              <w:right w:val="single" w:color="CCCCCC" w:sz="1"/>
+            </w:tcBorders>
+            <w:shd w:fill="F0F2F5"/>
+          </w:tcPr>
+          <w:p>
+            <w:r>
+              <w:rPr>
+                <w:b/>
+                <w:bCs/>
+              </w:rPr>
+            </w:r>
+          </w:p>
+        </w:tc>
+        <w:tc>
+          <w:tcPr>
+            <w:tcBorders>
+              <w:top w:val="single" w:color="CCCCCC" w:sz="1"/>
+              <w:left w:val="single" w:color="CCCCCC" w:sz="1"/>
+              <w:bottom w:val="single" w:color="CCCCCC" w:sz="1"/>
+              <w:right w:val="single" w:color="CCCCCC" w:sz="1"/>
+            </w:tcBorders>
+            <w:shd w:fill="F0F2F5"/>
+          </w:tcPr>
+          <w:p>
+            <w:r>
+              <w:rPr>
+                <w:b/>
+                <w:bCs/>
+              </w:rPr>
+            </w:r>
+          </w:p>
+        </w:tc>
+      </w:tr>
+      <w:tr>
+        <w:tc>
+          <w:tcPr>
+            <w:tcBorders>
+              <w:top w:val="single" w:color="CCCCCC" w:sz="1"/>
+              <w:left w:val="single" w:color="CCCCCC" w:sz="1"/>
+              <w:bottom w:val="single" w:color="CCCCCC" w:sz="1"/>
+              <w:right w:val="single" w:color="CCCCCC" w:sz="1"/>
+            </w:tcBorders>
+          </w:tcPr>
+          <w:p>
+            <w:r/>
+          </w:p>
+        </w:tc>
+        <w:tc>
+          <w:tcPr>
+            <w:tcBorders>
+              <w:top w:val="single" w:color="CCCCCC" w:sz="1"/>
+              <w:left w:val="single" w:color="CCCCCC" w:sz="1"/>
+              <w:bottom w:val="single" w:color="CCCCCC" w:sz="1"/>
+              <w:right w:val="single" w:color="CCCCCC" w:sz="1"/>
+            </w:tcBorders>
+          </w:tcPr>
+          <w:p>
+            <w:r/>
+          </w:p>
+        </w:tc>
+        <w:tc>
+          <w:tcPr>
+            <w:tcBorders>
+              <w:top w:val="single" w:color="CCCCCC" w:sz="1"/>
+              <w:left w:val="single" w:color="CCCCCC" w:sz="1"/>
+              <w:bottom w:val="single" w:color="CCCCCC" w:sz="1"/>
+              <w:right w:val="single" w:color="CCCCCC" w:sz="1"/>
+            </w:tcBorders>
+          </w:tcPr>
+          <w:p>
+            <w:r/>
+            <w:r/>
+          </w:p>
+        </w:tc>
+        <w:tc>
+          <w:tcPr>
+            <w:tcBorders>
+              <w:top w:val="single" w:color="CCCCCC" w:sz="1"/>
+              <w:left w:val="single" w:color="CCCCCC" w:sz="1"/>
+              <w:bottom w:val="single" w:color="CCCCCC" w:sz="1"/>
+              <w:right w:val="single" w:color="CCCCCC" w:sz="1"/>
+            </w:tcBorders>
+          </w:tcPr>
+          <w:p>
+            <w:r/>
+          </w:p>
+        </w:tc>
+      </w:tr>
+      <w:tr>
+        <w:tc>
+          <w:tcPr>
+            <w:tcBorders>
+              <w:top w:val="single" w:color="CCCCCC" w:sz="1"/>
+              <w:left w:val="single" w:color="CCCCCC" w:sz="1"/>
+              <w:bottom w:val="single" w:color="CCCCCC" w:sz="1"/>
+              <w:right w:val="single" w:color="CCCCCC" w:sz="1"/>
+            </w:tcBorders>
+          </w:tcPr>
+          <w:p>
+            <w:r/>
+          </w:p>
+        </w:tc>
+        <w:tc>
+          <w:tcPr>
+            <w:tcBorders>
+              <w:top w:val="single" w:color="CCCCCC" w:sz="1"/>
+              <w:left w:val="single" w:color="CCCCCC" w:sz="1"/>
+              <w:bottom w:val="single" w:color="CCCCCC" w:sz="1"/>
+              <w:right w:val="single" w:color="CCCCCC" w:sz="1"/>
+            </w:tcBorders>
+          </w:tcPr>
+          <w:p>
+            <w:r/>
+          </w:p>
+        </w:tc>
+        <w:tc>
+          <w:tcPr>
+            <w:tcBorders>
+              <w:top w:val="single" w:color="CCCCCC" w:sz="1"/>
+              <w:left w:val="single" w:color="CCCCCC" w:sz="1"/>
+              <w:bottom w:val="single" w:color="CCCCCC" w:sz="1"/>
+              <w:right w:val="single" w:color="CCCCCC" w:sz="1"/>
+            </w:tcBorders>
+          </w:tcPr>
+          <w:p>
+            <w:r/>
+          </w:p>
+        </w:tc>
+        <w:tc>
+          <w:tcPr>
+            <w:tcBorders>
+              <w:top w:val="single" w:color="CCCCCC" w:sz="1"/>
+              <w:left w:val="single" w:color="CCCCCC" w:sz="1"/>
+              <w:bottom w:val="single" w:color="CCCCCC" w:sz="1"/>
+              <w:right w:val="single" w:color="CCCCCC" w:sz="1"/>
+            </w:tcBorders>
+          </w:tcPr>
+          <w:p>
+            <w:r/>
+          </w:p>
+        </w:tc>
+      </w:tr>
+      <w:tr>
+        <w:tc>
+          <w:tcPr>
+            <w:tcBorders>
+              <w:top w:val="single" w:color="CCCCCC" w:sz="1"/>
+              <w:left w:val="single" w:color="CCCCCC" w:sz="1"/>
+              <w:bottom w:val="single" w:color="CCCCCC" w:sz="1"/>
+              <w:right w:val="single" w:color="CCCCCC" w:sz="1"/>
+            </w:tcBorders>
+          </w:tcPr>
+          <w:p>
+            <w:r/>
+          </w:p>
+        </w:tc>
+        <w:tc>
+          <w:tcPr>
+            <w:tcBorders>
+              <w:top w:val="single" w:color="CCCCCC" w:sz="1"/>
+              <w:left w:val="single" w:color="CCCCCC" w:sz="1"/>
+              <w:bottom w:val="single" w:color="CCCCCC" w:sz="1"/>
+              <w:right w:val="single" w:color="CCCCCC" w:sz="1"/>
+            </w:tcBorders>
+          </w:tcPr>
+          <w:p>
+            <w:r/>
+          </w:p>
+        </w:tc>
+        <w:tc>
+          <w:tcPr>
+            <w:tcBorders>
+              <w:top w:val="single" w:color="CCCCCC" w:sz="1"/>
+              <w:left w:val="single" w:color="CCCCCC" w:sz="1"/>
+              <w:bottom w:val="single" w:color="CCCCCC" w:sz="1"/>
+              <w:right w:val="single" w:color="CCCCCC" w:sz="1"/>
+            </w:tcBorders>
+          </w:tcPr>
+          <w:p>
+            <w:r/>
+          </w:p>
+        </w:tc>
+        <w:tc>
+          <w:tcPr>
+            <w:tcBorders>
+              <w:top w:val="single" w:color="CCCCCC" w:sz="1"/>
+              <w:left w:val="single" w:color="CCCCCC" w:sz="1"/>
+              <w:bottom w:val="single" w:color="CCCCCC" w:sz="1"/>
+              <w:right w:val="single" w:color="CCCCCC" w:sz="1"/>
+            </w:tcBorders>
+          </w:tcPr>
+          <w:p>
+            <w:r/>
+          </w:p>
+        </w:tc>
+      </w:tr>
+      <w:tr>
+        <w:tc>
+          <w:tcPr>
+            <w:tcBorders>
+              <w:top w:val="single" w:color="CCCCCC" w:sz="1"/>
+              <w:left w:val="single" w:color="CCCCCC" w:sz="1"/>
+              <w:bottom w:val="single" w:color="CCCCCC" w:sz="1"/>
+              <w:right w:val="single" w:color="CCCCCC" w:sz="1"/>
+            </w:tcBorders>
+          </w:tcPr>
+          <w:p>
+            <w:r/>
+          </w:p>
+        </w:tc>
+        <w:tc>
+          <w:tcPr>
+            <w:tcBorders>
+              <w:top w:val="single" w:color="CCCCCC" w:sz="1"/>
+              <w:left w:val="single" w:color="CCCCCC" w:sz="1"/>
+              <w:bottom w:val="single" w:color="CCCCCC" w:sz="1"/>
+              <w:right w:val="single" w:color="CCCCCC" w:sz="1"/>
+            </w:tcBorders>
+          </w:tcPr>
+          <w:p>
+            <w:r/>
+          </w:p>
+        </w:tc>
+        <w:tc>
+          <w:tcPr>
+            <w:tcBorders>
+              <w:top w:val="single" w:color="CCCCCC" w:sz="1"/>
+              <w:left w:val="single" w:color="CCCCCC" w:sz="1"/>
+              <w:bottom w:val="single" w:color="CCCCCC" w:sz="1"/>
+              <w:right w:val="single" w:color="CCCCCC" w:sz="1"/>
+            </w:tcBorders>
+          </w:tcPr>
+          <w:p>
+            <w:r/>
+          </w:p>
+        </w:tc>
+        <w:tc>
+          <w:tcPr>
+            <w:tcBorders>
+              <w:top w:val="single" w:color="CCCCCC" w:sz="1"/>
+              <w:left w:val="single" w:color="CCCCCC" w:sz="1"/>
+              <w:bottom w:val="single" w:color="CCCCCC" w:sz="1"/>
+              <w:right w:val="single" w:color="CCCCCC" w:sz="1"/>
+            </w:tcBorders>
+          </w:tcPr>
+          <w:p>
+            <w:r/>
+          </w:p>
+        </w:tc>
+      </w:tr>
+      <w:tr>
+        <w:tc>
+          <w:tcPr>
+            <w:tcBorders>
+              <w:top w:val="single" w:color="CCCCCC" w:sz="1"/>
+              <w:left w:val="single" w:color="CCCCCC" w:sz="1"/>
+              <w:bottom w:val="single" w:color="CCCCCC" w:sz="1"/>
+              <w:right w:val="single" w:color="CCCCCC" w:sz="1"/>
+            </w:tcBorders>
+          </w:tcPr>
+          <w:p>
+            <w:r/>
+          </w:p>
+        </w:tc>
+        <w:tc>
+          <w:tcPr>
+            <w:tcBorders>
+              <w:top w:val="single" w:color="CCCCCC" w:sz="1"/>
+              <w:left w:val="single" w:color="CCCCCC" w:sz="1"/>
+              <w:bottom w:val="single" w:color="CCCCCC" w:sz="1"/>
+              <w:right w:val="single" w:color="CCCCCC" w:sz="1"/>
+            </w:tcBorders>
+          </w:tcPr>
+          <w:p>
+            <w:r/>
+          </w:p>
+        </w:tc>
+        <w:tc>
+          <w:tcPr>
+            <w:tcBorders>
+              <w:top w:val="single" w:color="CCCCCC" w:sz="1"/>
+              <w:left w:val="single" w:color="CCCCCC" w:sz="1"/>
+              <w:bottom w:val="single" w:color="CCCCCC" w:sz="1"/>
+              <w:right w:val="single" w:color="CCCCCC" w:sz="1"/>
+            </w:tcBorders>
+          </w:tcPr>
+          <w:p>
+            <w:r/>
+          </w:p>
+        </w:tc>
+        <w:tc>
+          <w:tcPr>
+            <w:tcBorders>
+              <w:top w:val="single" w:color="CCCCCC" w:sz="1"/>
+              <w:left w:val="single" w:color="CCCCCC" w:sz="1"/>
+              <w:bottom w:val="single" w:color="CCCCCC" w:sz="1"/>
+              <w:right w:val="single" w:color="CCCCCC" w:sz="1"/>
+            </w:tcBorders>
+          </w:tcPr>
+          <w:p>
+            <w:r/>
+          </w:p>
+        </w:tc>
+      </w:tr>
+      <w:tr>
+        <w:tc>
+          <w:tcPr>
+            <w:tcBorders>
+              <w:top w:val="single" w:color="CCCCCC" w:sz="1"/>
+              <w:left w:val="single" w:color="CCCCCC" w:sz="1"/>
+              <w:bottom w:val="single" w:color="CCCCCC" w:sz="1"/>
+              <w:right w:val="single" w:color="CCCCCC" w:sz="1"/>
+            </w:tcBorders>
+          </w:tcPr>
+          <w:p>
+            <w:r/>
+          </w:p>
+        </w:tc>
+        <w:tc>
+          <w:tcPr>
+            <w:tcBorders>
+              <w:top w:val="single" w:color="CCCCCC" w:sz="1"/>
+              <w:left w:val="single" w:color="CCCCCC" w:sz="1"/>
+              <w:bottom w:val="single" w:color="CCCCCC" w:sz="1"/>
+              <w:right w:val="single" w:color="CCCCCC" w:sz="1"/>
+            </w:tcBorders>
+          </w:tcPr>
+          <w:p>
+            <w:r/>
+          </w:p>
+        </w:tc>
+        <w:tc>
+          <w:tcPr>
+            <w:tcBorders>
+              <w:top w:val="single" w:color="CCCCCC" w:sz="1"/>
+              <w:left w:val="single" w:color="CCCCCC" w:sz="1"/>
+              <w:bottom w:val="single" w:color="CCCCCC" w:sz="1"/>
+              <w:right w:val="single" w:color="CCCCCC" w:sz="1"/>
+            </w:tcBorders>
+          </w:tcPr>
+          <w:p>
+            <w:r/>
+          </w:p>
+        </w:tc>
+        <w:tc>
+          <w:tcPr>
+            <w:tcBorders>
+              <w:top w:val="single" w:color="CCCCCC" w:sz="1"/>
+              <w:left w:val="single" w:color="CCCCCC" w:sz="1"/>
+              <w:bottom w:val="single" w:color="CCCCCC" w:sz="1"/>
+              <w:right w:val="single" w:color="CCCCCC" w:sz="1"/>
+            </w:tcBorders>
+          </w:tcPr>
+          <w:p>
+            <w:r/>
+          </w:p>
+        </w:tc>
+      </w:tr>
+      <w:tr>
+        <w:tc>
+          <w:tcPr>
+            <w:tcBorders>
+              <w:top w:val="single" w:color="CCCCCC" w:sz="1"/>
+              <w:left w:val="single" w:color="CCCCCC" w:sz="1"/>
+              <w:bottom w:val="single" w:color="CCCCCC" w:sz="1"/>
+              <w:right w:val="single" w:color="CCCCCC" w:sz="1"/>
+            </w:tcBorders>
+          </w:tcPr>
+          <w:p>
+            <w:r/>
+          </w:p>
+        </w:tc>
+        <w:tc>
+          <w:tcPr>
+            <w:tcBorders>
+              <w:top w:val="single" w:color="CCCCCC" w:sz="1"/>
+              <w:left w:val="single" w:color="CCCCCC" w:sz="1"/>
+              <w:bottom w:val="single" w:color="CCCCCC" w:sz="1"/>
+              <w:right w:val="single" w:color="CCCCCC" w:sz="1"/>
+            </w:tcBorders>
+          </w:tcPr>
+          <w:p>
+            <w:r/>
+          </w:p>
+        </w:tc>
+        <w:tc>
+          <w:tcPr>
+            <w:tcBorders>
+              <w:top w:val="single" w:color="CCCCCC" w:sz="1"/>
+              <w:left w:val="single" w:color="CCCCCC" w:sz="1"/>
+              <w:bottom w:val="single" w:color="CCCCCC" w:sz="1"/>
+              <w:right w:val="single" w:color="CCCCCC" w:sz="1"/>
+            </w:tcBorders>
+          </w:tcPr>
+          <w:p>
+            <w:r/>
+          </w:p>
+        </w:tc>
+        <w:tc>
+          <w:tcPr>
+            <w:tcBorders>
+              <w:top w:val="single" w:color="CCCCCC" w:sz="1"/>
+              <w:left w:val="single" w:color="CCCCCC" w:sz="1"/>
+              <w:bottom w:val="single" w:color="CCCCCC" w:sz="1"/>
+              <w:right w:val="single" w:color="CCCCCC" w:sz="1"/>
+            </w:tcBorders>
+          </w:tcPr>
+          <w:p>
+            <w:r/>
+          </w:p>
+        </w:tc>
+      </w:tr>
+      <w:tr>
+        <w:tc>
+          <w:tcPr>
+            <w:tcBorders>
+              <w:top w:val="single" w:color="CCCCCC" w:sz="1"/>
+              <w:left w:val="single" w:color="CCCCCC" w:sz="1"/>
+              <w:bottom w:val="single" w:color="CCCCCC" w:sz="1"/>
+              <w:right w:val="single" w:color="CCCCCC" w:sz="1"/>
+            </w:tcBorders>
+          </w:tcPr>
+          <w:p>
+            <w:r/>
+          </w:p>
+        </w:tc>
+        <w:tc>
+          <w:tcPr>
+            <w:tcBorders>
+              <w:top w:val="single" w:color="CCCCCC" w:sz="1"/>
+              <w:left w:val="single" w:color="CCCCCC" w:sz="1"/>
+              <w:bottom w:val="single" w:color="CCCCCC" w:sz="1"/>
+              <w:right w:val="single" w:color="CCCCCC" w:sz="1"/>
+            </w:tcBorders>
+          </w:tcPr>
+          <w:p>
+            <w:r/>
+          </w:p>
+        </w:tc>
+        <w:tc>
+          <w:tcPr>
+            <w:tcBorders>
+              <w:top w:val="single" w:color="CCCCCC" w:sz="1"/>
+              <w:left w:val="single" w:color="CCCCCC" w:sz="1"/>
+              <w:bottom w:val="single" w:color="CCCCCC" w:sz="1"/>
+              <w:right w:val="single" w:color="CCCCCC" w:sz="1"/>
+            </w:tcBorders>
+          </w:tcPr>
+          <w:p>
+            <w:r/>
+          </w:p>
+        </w:tc>
+        <w:tc>
+          <w:tcPr>
+            <w:tcBorders>
+              <w:top w:val="single" w:color="CCCCCC" w:sz="1"/>
+              <w:left w:val="single" w:color="CCCCCC" w:sz="1"/>
+              <w:bottom w:val="single" w:color="CCCCCC" w:sz="1"/>
+              <w:right w:val="single" w:color="CCCCCC" w:sz="1"/>
+            </w:tcBorders>
+          </w:tcPr>
+          <w:p>
+            <w:r/>
+          </w:p>
+        </w:tc>
+      </w:tr>
+      <w:tr>
+        <w:tc>
+          <w:tcPr>
+            <w:tcBorders>
+              <w:top w:val="single" w:color="CCCCCC" w:sz="1"/>
+              <w:left w:val="single" w:color="CCCCCC" w:sz="1"/>
+              <w:bottom w:val="single" w:color="CCCCCC" w:sz="1"/>
+              <w:right w:val="single" w:color="CCCCCC" w:sz="1"/>
+            </w:tcBorders>
+          </w:tcPr>
+          <w:p>
+            <w:r/>
+          </w:p>
+        </w:tc>
+        <w:tc>
+          <w:tcPr>
+            <w:tcBorders>
+              <w:top w:val="single" w:color="CCCCCC" w:sz="1"/>
+              <w:left w:val="single" w:color="CCCCCC" w:sz="1"/>
+              <w:bottom w:val="single" w:color="CCCCCC" w:sz="1"/>
+              <w:right w:val="single" w:color="CCCCCC" w:sz="1"/>
+            </w:tcBorders>
+          </w:tcPr>
+          <w:p>
+            <w:r/>
+          </w:p>
+        </w:tc>
+        <w:tc>
+          <w:tcPr>
+            <w:tcBorders>
+              <w:top w:val="single" w:color="CCCCCC" w:sz="1"/>
+              <w:left w:val="single" w:color="CCCCCC" w:sz="1"/>
+              <w:bottom w:val="single" w:color="CCCCCC" w:sz="1"/>
+              <w:right w:val="single" w:color="CCCCCC" w:sz="1"/>
+            </w:tcBorders>
+          </w:tcPr>
+          <w:p>
+            <w:r/>
+          </w:p>
+        </w:tc>
+        <w:tc>
+          <w:tcPr>
+            <w:tcBorders>
+              <w:top w:val="single" w:color="CCCCCC" w:sz="1"/>
+              <w:left w:val="single" w:color="CCCCCC" w:sz="1"/>
+              <w:bottom w:val="single" w:color="CCCCCC" w:sz="1"/>
+              <w:right w:val="single" w:color="CCCCCC" w:sz="1"/>
+            </w:tcBorders>
+          </w:tcPr>
+          <w:p>
+            <w:r/>
+          </w:p>
+        </w:tc>
+      </w:tr>
+      <w:tr>
+        <w:tc>
+          <w:tcPr>
+            <w:tcBorders>
+              <w:top w:val="single" w:color="CCCCCC" w:sz="1"/>
+              <w:left w:val="single" w:color="CCCCCC" w:sz="1"/>
+              <w:bottom w:val="single" w:color="CCCCCC" w:sz="1"/>
+              <w:right w:val="single" w:color="CCCCCC" w:sz="1"/>
+            </w:tcBorders>
+          </w:tcPr>
+          <w:p>
+            <w:r/>
+          </w:p>
+        </w:tc>
+        <w:tc>
+          <w:tcPr>
+            <w:tcBorders>
+              <w:top w:val="single" w:color="CCCCCC" w:sz="1"/>
+              <w:left w:val="single" w:color="CCCCCC" w:sz="1"/>
+              <w:bottom w:val="single" w:color="CCCCCC" w:sz="1"/>
+              <w:right w:val="single" w:color="CCCCCC" w:sz="1"/>
+            </w:tcBorders>
+          </w:tcPr>
+          <w:p>
+            <w:r/>
+          </w:p>
+        </w:tc>
+        <w:tc>
+          <w:tcPr>
+            <w:tcBorders>
+              <w:top w:val="single" w:color="CCCCCC" w:sz="1"/>
+              <w:left w:val="single" w:color="CCCCCC" w:sz="1"/>
+              <w:bottom w:val="single" w:color="CCCCCC" w:sz="1"/>
+              <w:right w:val="single" w:color="CCCCCC" w:sz="1"/>
+            </w:tcBorders>
+          </w:tcPr>
+          <w:p>
+            <w:r/>
+          </w:p>
+        </w:tc>
+        <w:tc>
+          <w:tcPr>
+            <w:tcBorders>
+              <w:top w:val="single" w:color="CCCCCC" w:sz="1"/>
+              <w:left w:val="single" w:color="CCCCCC" w:sz="1"/>
+              <w:bottom w:val="single" w:color="CCCCCC" w:sz="1"/>
+              <w:right w:val="single" w:color="CCCCCC" w:sz="1"/>
+            </w:tcBorders>
+          </w:tcPr>
+          <w:p>
+            <w:r/>
+          </w:p>
+        </w:tc>
+      </w:tr>
+      <w:tr>
+        <w:tc>
+          <w:tcPr>
+            <w:tcBorders>
+              <w:top w:val="single" w:color="CCCCCC" w:sz="1"/>
+              <w:left w:val="single" w:color="CCCCCC" w:sz="1"/>
+              <w:bottom w:val="single" w:color="CCCCCC" w:sz="1"/>
+              <w:right w:val="single" w:color="CCCCCC" w:sz="1"/>
+            </w:tcBorders>
+          </w:tcPr>
+          <w:p>
+            <w:r/>
+          </w:p>
+        </w:tc>
+        <w:tc>
+          <w:tcPr>
+            <w:tcBorders>
+              <w:top w:val="single" w:color="CCCCCC" w:sz="1"/>
+              <w:left w:val="single" w:color="CCCCCC" w:sz="1"/>
+              <w:bottom w:val="single" w:color="CCCCCC" w:sz="1"/>
+              <w:right w:val="single" w:color="CCCCCC" w:sz="1"/>
+            </w:tcBorders>
+          </w:tcPr>
+          <w:p>
+            <w:r/>
+          </w:p>
+        </w:tc>
+        <w:tc>
+          <w:tcPr>
+            <w:tcBorders>
+              <w:top w:val="single" w:color="CCCCCC" w:sz="1"/>
+              <w:left w:val="single" w:color="CCCCCC" w:sz="1"/>
+              <w:bottom w:val="single" w:color="CCCCCC" w:sz="1"/>
+              <w:right w:val="single" w:color="CCCCCC" w:sz="1"/>
+            </w:tcBorders>
+          </w:tcPr>
+          <w:p>
+            <w:r/>
+          </w:p>
+        </w:tc>
+        <w:tc>
+          <w:tcPr>
+            <w:tcBorders>
+              <w:top w:val="single" w:color="CCCCCC" w:sz="1"/>
+              <w:left w:val="single" w:color="CCCCCC" w:sz="1"/>
+              <w:bottom w:val="single" w:color="CCCCCC" w:sz="1"/>
+              <w:right w:val="single" w:color="CCCCCC" w:sz="1"/>
+            </w:tcBorders>
+          </w:tcPr>
+          <w:p>
+            <w:r/>
+          </w:p>
+        </w:tc>
+      </w:tr>
+      <w:tr>
+        <w:tc>
+          <w:tcPr>
+            <w:tcBorders>
+              <w:top w:val="single" w:color="CCCCCC" w:sz="1"/>
+              <w:left w:val="single" w:color="CCCCCC" w:sz="1"/>
+              <w:bottom w:val="single" w:color="CCCCCC" w:sz="1"/>
+              <w:right w:val="single" w:color="CCCCCC" w:sz="1"/>
+            </w:tcBorders>
+          </w:tcPr>
+          <w:p>
+            <w:r/>
+          </w:p>
+        </w:tc>
+        <w:tc>
+          <w:tcPr>
+            <w:tcBorders>
+              <w:top w:val="single" w:color="CCCCCC" w:sz="1"/>
+              <w:left w:val="single" w:color="CCCCCC" w:sz="1"/>
+              <w:bottom w:val="single" w:color="CCCCCC" w:sz="1"/>
+              <w:right w:val="single" w:color="CCCCCC" w:sz="1"/>
+            </w:tcBorders>
+          </w:tcPr>
+          <w:p>
+            <w:r/>
+          </w:p>
+        </w:tc>
+        <w:tc>
+          <w:tcPr>
+            <w:tcBorders>
+              <w:top w:val="single" w:color="CCCCCC" w:sz="1"/>
+              <w:left w:val="single" w:color="CCCCCC" w:sz="1"/>
+              <w:bottom w:val="single" w:color="CCCCCC" w:sz="1"/>
+              <w:right w:val="single" w:color="CCCCCC" w:sz="1"/>
+            </w:tcBorders>
+          </w:tcPr>
+          <w:p>
+            <w:r/>
+          </w:p>
+        </w:tc>
+        <w:tc>
+          <w:tcPr>
+            <w:tcBorders>
+              <w:top w:val="single" w:color="CCCCCC" w:sz="1"/>
+              <w:left w:val="single" w:color="CCCCCC" w:sz="1"/>
+              <w:bottom w:val="single" w:color="CCCCCC" w:sz="1"/>
+              <w:right w:val="single" w:color="CCCCCC" w:sz="1"/>
+            </w:tcBorders>
+          </w:tcPr>
+          <w:p>
+            <w:r/>
+          </w:p>
+        </w:tc>
+      </w:tr>
+    </w:tbl>
+    <w:p/>
+    <w:p/>
+    <w:p>
+      <w:pPr>
+        <w:pStyle w:val="Heading2"/>
+        <w:spacing w:before="160" w:after="80"/>
+      </w:pPr>
+      <w:r>
+        <w:t xml:space="preserve">Planned / build-up (not yet implemented)</w:t>
+      </w:r>
+    </w:p>
+    <w:p/>
+    <w:tbl>
+      <w:tblPr>
+        <w:tblW w:type="pct" w:w="100%"/>
+        <w:tblBorders>
+          <w:top w:val="single" w:color="auto" w:sz="4"/>
+          <w:left w:val="single" w:color="auto" w:sz="4"/>
+          <w:bottom w:val="single" w:color="auto" w:sz="4"/>
+          <w:right w:val="single" w:color="auto" w:sz="4"/>
+          <w:insideH w:val="single" w:color="auto" w:sz="4"/>
+          <w:insideV w:val="single" w:color="auto" w:sz="4"/>
+        </w:tblBorders>
+      </w:tblPr>
+      <w:tblGrid>
+        <w:gridCol w:w="100"/>
+        <w:gridCol w:w="100"/>
+        <w:gridCol w:w="100"/>
+        <w:gridCol w:w="100"/>
+      </w:tblGrid>
+      <w:tr>
+        <w:tc>
+          <w:tcPr>
+            <w:tcBorders>
+              <w:top w:val="single" w:color="CCCCCC" w:sz="1"/>
+              <w:left w:val="single" w:color="CCCCCC" w:sz="1"/>
+              <w:bottom w:val="single" w:color="CCCCCC" w:sz="1"/>
+              <w:right w:val="single" w:color="CCCCCC" w:sz="1"/>
+            </w:tcBorders>
+            <w:shd w:fill="F0F2F5"/>
+          </w:tcPr>
+          <w:p>
+            <w:r>
+              <w:rPr>
+                <w:b/>
+                <w:bCs/>
+              </w:rPr>
+            </w:r>
+          </w:p>
+        </w:tc>
+        <w:tc>
+          <w:tcPr>
+            <w:tcBorders>
+              <w:top w:val="single" w:color="CCCCCC" w:sz="1"/>
+              <w:left w:val="single" w:color="CCCCCC" w:sz="1"/>
+              <w:bottom w:val="single" w:color="CCCCCC" w:sz="1"/>
+              <w:right w:val="single" w:color="CCCCCC" w:sz="1"/>
+            </w:tcBorders>
+            <w:shd w:fill="F0F2F5"/>
+          </w:tcPr>
+          <w:p>
+            <w:r>
+              <w:rPr>
+                <w:b/>
+                <w:bCs/>
+              </w:rPr>
+            </w:r>
+          </w:p>
+        </w:tc>
+        <w:tc>
+          <w:tcPr>
+            <w:tcBorders>
+              <w:top w:val="single" w:color="CCCCCC" w:sz="1"/>
+              <w:left w:val="single" w:color="CCCCCC" w:sz="1"/>
+              <w:bottom w:val="single" w:color="CCCCCC" w:sz="1"/>
+              <w:right w:val="single" w:color="CCCCCC" w:sz="1"/>
+            </w:tcBorders>
+            <w:shd w:fill="F0F2F5"/>
+          </w:tcPr>
+          <w:p>
+            <w:r>
+              <w:rPr>
+                <w:b/>
+                <w:bCs/>
+              </w:rPr>
+            </w:r>
+          </w:p>
+        </w:tc>
+        <w:tc>
+          <w:tcPr>
+            <w:tcBorders>
+              <w:top w:val="single" w:color="CCCCCC" w:sz="1"/>
+              <w:left w:val="single" w:color="CCCCCC" w:sz="1"/>
+              <w:bottom w:val="single" w:color="CCCCCC" w:sz="1"/>
+              <w:right w:val="single" w:color="CCCCCC" w:sz="1"/>
+            </w:tcBorders>
+            <w:shd w:fill="F0F2F5"/>
+          </w:tcPr>
+          <w:p>
+            <w:r>
+              <w:rPr>
+                <w:b/>
+                <w:bCs/>
+              </w:rPr>
+            </w:r>
+          </w:p>
+        </w:tc>
+      </w:tr>
+      <w:tr>
+        <w:tc>
+          <w:tcPr>
+            <w:tcBorders>
+              <w:top w:val="single" w:color="CCCCCC" w:sz="1"/>
+              <w:left w:val="single" w:color="CCCCCC" w:sz="1"/>
+              <w:bottom w:val="single" w:color="CCCCCC" w:sz="1"/>
+              <w:right w:val="single" w:color="CCCCCC" w:sz="1"/>
+            </w:tcBorders>
+          </w:tcPr>
+          <w:p>
+            <w:r/>
+          </w:p>
+        </w:tc>
+        <w:tc>
+          <w:tcPr>
+            <w:tcBorders>
+              <w:top w:val="single" w:color="CCCCCC" w:sz="1"/>
+              <w:left w:val="single" w:color="CCCCCC" w:sz="1"/>
+              <w:bottom w:val="single" w:color="CCCCCC" w:sz="1"/>
+              <w:right w:val="single" w:color="CCCCCC" w:sz="1"/>
+            </w:tcBorders>
+          </w:tcPr>
+          <w:p>
+            <w:r/>
+          </w:p>
+        </w:tc>
+        <w:tc>
+          <w:tcPr>
+            <w:tcBorders>
+              <w:top w:val="single" w:color="CCCCCC" w:sz="1"/>
+              <w:left w:val="single" w:color="CCCCCC" w:sz="1"/>
+              <w:bottom w:val="single" w:color="CCCCCC" w:sz="1"/>
+              <w:right w:val="single" w:color="CCCCCC" w:sz="1"/>
+            </w:tcBorders>
+          </w:tcPr>
+          <w:p>
+            <w:r/>
+          </w:p>
+        </w:tc>
+        <w:tc>
+          <w:tcPr>
+            <w:tcBorders>
+              <w:top w:val="single" w:color="CCCCCC" w:sz="1"/>
+              <w:left w:val="single" w:color="CCCCCC" w:sz="1"/>
+              <w:bottom w:val="single" w:color="CCCCCC" w:sz="1"/>
+              <w:right w:val="single" w:color="CCCCCC" w:sz="1"/>
+            </w:tcBorders>
+          </w:tcPr>
+          <w:p>
+            <w:r/>
+            <w:r/>
+          </w:p>
+        </w:tc>
+      </w:tr>
+      <w:tr>
+        <w:tc>
+          <w:tcPr>
+            <w:tcBorders>
+              <w:top w:val="single" w:color="CCCCCC" w:sz="1"/>
+              <w:left w:val="single" w:color="CCCCCC" w:sz="1"/>
+              <w:bottom w:val="single" w:color="CCCCCC" w:sz="1"/>
+              <w:right w:val="single" w:color="CCCCCC" w:sz="1"/>
+            </w:tcBorders>
+          </w:tcPr>
+          <w:p>
+            <w:r/>
+          </w:p>
+        </w:tc>
+        <w:tc>
+          <w:tcPr>
+            <w:tcBorders>
+              <w:top w:val="single" w:color="CCCCCC" w:sz="1"/>
+              <w:left w:val="single" w:color="CCCCCC" w:sz="1"/>
+              <w:bottom w:val="single" w:color="CCCCCC" w:sz="1"/>
+              <w:right w:val="single" w:color="CCCCCC" w:sz="1"/>
+            </w:tcBorders>
+          </w:tcPr>
+          <w:p>
+            <w:r/>
+          </w:p>
+        </w:tc>
+        <w:tc>
+          <w:tcPr>
+            <w:tcBorders>
+              <w:top w:val="single" w:color="CCCCCC" w:sz="1"/>
+              <w:left w:val="single" w:color="CCCCCC" w:sz="1"/>
+              <w:bottom w:val="single" w:color="CCCCCC" w:sz="1"/>
+              <w:right w:val="single" w:color="CCCCCC" w:sz="1"/>
+            </w:tcBorders>
+          </w:tcPr>
+          <w:p>
+            <w:r/>
+          </w:p>
+        </w:tc>
+        <w:tc>
+          <w:tcPr>
+            <w:tcBorders>
+              <w:top w:val="single" w:color="CCCCCC" w:sz="1"/>
+              <w:left w:val="single" w:color="CCCCCC" w:sz="1"/>
+              <w:bottom w:val="single" w:color="CCCCCC" w:sz="1"/>
+              <w:right w:val="single" w:color="CCCCCC" w:sz="1"/>
+            </w:tcBorders>
+          </w:tcPr>
+          <w:p>
+            <w:r/>
+            <w:r/>
+            <w:r/>
+          </w:p>
+        </w:tc>
+      </w:tr>
+      <w:tr>
+        <w:tc>
+          <w:tcPr>
+            <w:tcBorders>
+              <w:top w:val="single" w:color="CCCCCC" w:sz="1"/>
+              <w:left w:val="single" w:color="CCCCCC" w:sz="1"/>
+              <w:bottom w:val="single" w:color="CCCCCC" w:sz="1"/>
+              <w:right w:val="single" w:color="CCCCCC" w:sz="1"/>
+            </w:tcBorders>
+          </w:tcPr>
+          <w:p>
+            <w:r/>
+          </w:p>
+        </w:tc>
+        <w:tc>
+          <w:tcPr>
+            <w:tcBorders>
+              <w:top w:val="single" w:color="CCCCCC" w:sz="1"/>
+              <w:left w:val="single" w:color="CCCCCC" w:sz="1"/>
+              <w:bottom w:val="single" w:color="CCCCCC" w:sz="1"/>
+              <w:right w:val="single" w:color="CCCCCC" w:sz="1"/>
+            </w:tcBorders>
+          </w:tcPr>
+          <w:p>
+            <w:r/>
+          </w:p>
+        </w:tc>
+        <w:tc>
+          <w:tcPr>
+            <w:tcBorders>
+              <w:top w:val="single" w:color="CCCCCC" w:sz="1"/>
+              <w:left w:val="single" w:color="CCCCCC" w:sz="1"/>
+              <w:bottom w:val="single" w:color="CCCCCC" w:sz="1"/>
+              <w:right w:val="single" w:color="CCCCCC" w:sz="1"/>
+            </w:tcBorders>
+          </w:tcPr>
+          <w:p>
+            <w:r/>
+          </w:p>
+        </w:tc>
+        <w:tc>
+          <w:tcPr>
+            <w:tcBorders>
+              <w:top w:val="single" w:color="CCCCCC" w:sz="1"/>
+              <w:left w:val="single" w:color="CCCCCC" w:sz="1"/>
+              <w:bottom w:val="single" w:color="CCCCCC" w:sz="1"/>
+              <w:right w:val="single" w:color="CCCCCC" w:sz="1"/>
+            </w:tcBorders>
+          </w:tcPr>
+          <w:p>
+            <w:r/>
+          </w:p>
+        </w:tc>
+      </w:tr>
+      <w:tr>
+        <w:tc>
+          <w:tcPr>
+            <w:tcBorders>
+              <w:top w:val="single" w:color="CCCCCC" w:sz="1"/>
+              <w:left w:val="single" w:color="CCCCCC" w:sz="1"/>
+              <w:bottom w:val="single" w:color="CCCCCC" w:sz="1"/>
+              <w:right w:val="single" w:color="CCCCCC" w:sz="1"/>
+            </w:tcBorders>
+          </w:tcPr>
+          <w:p>
+            <w:r/>
+          </w:p>
+        </w:tc>
+        <w:tc>
+          <w:tcPr>
+            <w:tcBorders>
+              <w:top w:val="single" w:color="CCCCCC" w:sz="1"/>
+              <w:left w:val="single" w:color="CCCCCC" w:sz="1"/>
+              <w:bottom w:val="single" w:color="CCCCCC" w:sz="1"/>
+              <w:right w:val="single" w:color="CCCCCC" w:sz="1"/>
+            </w:tcBorders>
+          </w:tcPr>
+          <w:p>
+            <w:r/>
+          </w:p>
+        </w:tc>
+        <w:tc>
+          <w:tcPr>
+            <w:tcBorders>
+              <w:top w:val="single" w:color="CCCCCC" w:sz="1"/>
+              <w:left w:val="single" w:color="CCCCCC" w:sz="1"/>
+              <w:bottom w:val="single" w:color="CCCCCC" w:sz="1"/>
+              <w:right w:val="single" w:color="CCCCCC" w:sz="1"/>
+            </w:tcBorders>
+          </w:tcPr>
+          <w:p>
+            <w:r/>
+          </w:p>
+        </w:tc>
+        <w:tc>
+          <w:tcPr>
+            <w:tcBorders>
+              <w:top w:val="single" w:color="CCCCCC" w:sz="1"/>
+              <w:left w:val="single" w:color="CCCCCC" w:sz="1"/>
+              <w:bottom w:val="single" w:color="CCCCCC" w:sz="1"/>
+              <w:right w:val="single" w:color="CCCCCC" w:sz="1"/>
+            </w:tcBorders>
+          </w:tcPr>
+          <w:p>
+            <w:r/>
+            <w:r/>
+          </w:p>
+        </w:tc>
+      </w:tr>
+      <w:tr>
+        <w:tc>
+          <w:tcPr>
+            <w:tcBorders>
+              <w:top w:val="single" w:color="CCCCCC" w:sz="1"/>
+              <w:left w:val="single" w:color="CCCCCC" w:sz="1"/>
+              <w:bottom w:val="single" w:color="CCCCCC" w:sz="1"/>
+              <w:right w:val="single" w:color="CCCCCC" w:sz="1"/>
+            </w:tcBorders>
+          </w:tcPr>
+          <w:p>
+            <w:r/>
+          </w:p>
+        </w:tc>
+        <w:tc>
+          <w:tcPr>
+            <w:tcBorders>
+              <w:top w:val="single" w:color="CCCCCC" w:sz="1"/>
+              <w:left w:val="single" w:color="CCCCCC" w:sz="1"/>
+              <w:bottom w:val="single" w:color="CCCCCC" w:sz="1"/>
+              <w:right w:val="single" w:color="CCCCCC" w:sz="1"/>
+            </w:tcBorders>
+          </w:tcPr>
+          <w:p>
+            <w:r/>
+          </w:p>
+        </w:tc>
+        <w:tc>
+          <w:tcPr>
+            <w:tcBorders>
+              <w:top w:val="single" w:color="CCCCCC" w:sz="1"/>
+              <w:left w:val="single" w:color="CCCCCC" w:sz="1"/>
+              <w:bottom w:val="single" w:color="CCCCCC" w:sz="1"/>
+              <w:right w:val="single" w:color="CCCCCC" w:sz="1"/>
+            </w:tcBorders>
+          </w:tcPr>
+          <w:p>
+            <w:r/>
+          </w:p>
+        </w:tc>
+        <w:tc>
+          <w:tcPr>
+            <w:tcBorders>
+              <w:top w:val="single" w:color="CCCCCC" w:sz="1"/>
+              <w:left w:val="single" w:color="CCCCCC" w:sz="1"/>
+              <w:bottom w:val="single" w:color="CCCCCC" w:sz="1"/>
+              <w:right w:val="single" w:color="CCCCCC" w:sz="1"/>
+            </w:tcBorders>
+          </w:tcPr>
+          <w:p>
+            <w:r/>
+          </w:p>
+        </w:tc>
+      </w:tr>
+      <w:tr>
+        <w:tc>
+          <w:tcPr>
+            <w:tcBorders>
+              <w:top w:val="single" w:color="CCCCCC" w:sz="1"/>
+              <w:left w:val="single" w:color="CCCCCC" w:sz="1"/>
+              <w:bottom w:val="single" w:color="CCCCCC" w:sz="1"/>
+              <w:right w:val="single" w:color="CCCCCC" w:sz="1"/>
+            </w:tcBorders>
+          </w:tcPr>
+          <w:p>
+            <w:r/>
+          </w:p>
+        </w:tc>
+        <w:tc>
+          <w:tcPr>
+            <w:tcBorders>
+              <w:top w:val="single" w:color="CCCCCC" w:sz="1"/>
+              <w:left w:val="single" w:color="CCCCCC" w:sz="1"/>
+              <w:bottom w:val="single" w:color="CCCCCC" w:sz="1"/>
+              <w:right w:val="single" w:color="CCCCCC" w:sz="1"/>
+            </w:tcBorders>
+          </w:tcPr>
+          <w:p>
+            <w:r/>
+          </w:p>
+        </w:tc>
+        <w:tc>
+          <w:tcPr>
+            <w:tcBorders>
+              <w:top w:val="single" w:color="CCCCCC" w:sz="1"/>
+              <w:left w:val="single" w:color="CCCCCC" w:sz="1"/>
+              <w:bottom w:val="single" w:color="CCCCCC" w:sz="1"/>
+              <w:right w:val="single" w:color="CCCCCC" w:sz="1"/>
+            </w:tcBorders>
+          </w:tcPr>
+          <w:p>
+            <w:r/>
+          </w:p>
+        </w:tc>
+        <w:tc>
+          <w:tcPr>
+            <w:tcBorders>
+              <w:top w:val="single" w:color="CCCCCC" w:sz="1"/>
+              <w:left w:val="single" w:color="CCCCCC" w:sz="1"/>
+              <w:bottom w:val="single" w:color="CCCCCC" w:sz="1"/>
+              <w:right w:val="single" w:color="CCCCCC" w:sz="1"/>
+            </w:tcBorders>
+          </w:tcPr>
+          <w:p>
+            <w:r/>
+          </w:p>
+        </w:tc>
+      </w:tr>
+    </w:tbl>
+    <w:p/>
     <w:p/>
     <w:p>
       <w:pPr>
@@ -2144,7 +4099,144 @@
         <w:spacing w:before="160" w:after="80"/>
       </w:pPr>
       <w:r>
-        <w:t xml:space="preserve">6. Architecture</w:t>
+        <w:t xml:space="preserve">7. Scope boundaries (explicitly NOT built)</w:t>
+      </w:r>
+    </w:p>
+    <w:p/>
+    <w:p>
+      <w:r>
+        <w:t xml:space="preserve">Out of scope for this 15-day part-time proof-of-concept:</w:t>
+      </w:r>
+    </w:p>
+    <w:p/>
+    <w:p>
+      <w:pPr>
+        <w:pStyle w:val="ListParagraph"/>
+        <w:numPr>
+          <w:ilvl w:val="0"/>
+          <w:numId w:val="1"/>
+        </w:numPr>
+      </w:pPr>
+      <w:r>
+        <w:t xml:space="preserve">Real MOM / LTA / BCA / Hubble API integration</w:t>
+      </w:r>
+    </w:p>
+    <w:p>
+      <w:pPr>
+        <w:pStyle w:val="ListParagraph"/>
+        <w:numPr>
+          <w:ilvl w:val="0"/>
+          <w:numId w:val="1"/>
+        </w:numPr>
+      </w:pPr>
+      <w:r>
+        <w:t xml:space="preserve">Real government credential verification</w:t>
+      </w:r>
+    </w:p>
+    <w:p>
+      <w:pPr>
+        <w:pStyle w:val="ListParagraph"/>
+        <w:numPr>
+          <w:ilvl w:val="0"/>
+          <w:numId w:val="1"/>
+        </w:numPr>
+      </w:pPr>
+      <w:r>
+        <w:t xml:space="preserve">NRIC or any real personal data (placeholders only)</w:t>
+      </w:r>
+    </w:p>
+    <w:p>
+      <w:pPr>
+        <w:pStyle w:val="ListParagraph"/>
+        <w:numPr>
+          <w:ilvl w:val="0"/>
+          <w:numId w:val="1"/>
+        </w:numPr>
+      </w:pPr>
+      <w:r>
+        <w:t xml:space="preserve">Mobile app</w:t>
+      </w:r>
+    </w:p>
+    <w:p>
+      <w:pPr>
+        <w:pStyle w:val="ListParagraph"/>
+        <w:numPr>
+          <w:ilvl w:val="0"/>
+          <w:numId w:val="1"/>
+        </w:numPr>
+      </w:pPr>
+      <w:r>
+        <w:t xml:space="preserve">Tokens, NFTs, cryptocurrency, payments</w:t>
+      </w:r>
+    </w:p>
+    <w:p>
+      <w:pPr>
+        <w:pStyle w:val="ListParagraph"/>
+        <w:numPr>
+          <w:ilvl w:val="0"/>
+          <w:numId w:val="1"/>
+        </w:numPr>
+      </w:pPr>
+      <w:r>
+        <w:t xml:space="preserve">AI, IoT</w:t>
+      </w:r>
+    </w:p>
+    <w:p>
+      <w:pPr>
+        <w:pStyle w:val="ListParagraph"/>
+        <w:numPr>
+          <w:ilvl w:val="0"/>
+          <w:numId w:val="1"/>
+        </w:numPr>
+      </w:pPr>
+      <w:r>
+        <w:t xml:space="preserve">A full PTW system or full WSH management system</w:t>
+      </w:r>
+    </w:p>
+    <w:p>
+      <w:pPr>
+        <w:pStyle w:val="ListParagraph"/>
+        <w:numPr>
+          <w:ilvl w:val="0"/>
+          <w:numId w:val="1"/>
+        </w:numPr>
+      </w:pPr>
+      <w:r>
+        <w:t xml:space="preserve">More than ~15 UI screens or more than ~6 core contract functions</w:t>
+      </w:r>
+    </w:p>
+    <w:p/>
+    <w:p>
+      <w:r>
+        <w:t xml:space="preserve">Site-specific checks (lifting plan, crane position, ground condition, weather,</w:t>
+      </w:r>
+    </w:p>
+    <w:p>
+      <w:r>
+        <w:t xml:space="preserve">risk assessment, toolbox briefing, physical inspection, final PTW approval) stay</w:t>
+      </w:r>
+    </w:p>
+    <w:p>
+      <w:r>
+        <w:t xml:space="preserve">in the e-PTW system and are out of scope for the blockchain layer.</w:t>
+      </w:r>
+    </w:p>
+    <w:p/>
+    <w:p>
+      <w:pPr>
+        <w:pBdr>
+          <w:bottom w:val="single" w:color="DDDDDD" w:sz="6"/>
+        </w:pBdr>
+      </w:pPr>
+    </w:p>
+    <w:p/>
+    <w:p>
+      <w:pPr>
+        <w:pStyle w:val="Heading1"/>
+        <w:spacing w:before="160" w:after="80"/>
+      </w:pPr>
+      <w:r>
+        <w:t xml:space="preserve">8. Architecture</w:t>
       </w:r>
     </w:p>
     <w:p/>
@@ -2416,7 +4508,7 @@
         <w:spacing w:before="160" w:after="80"/>
       </w:pPr>
       <w:r>
-        <w:t xml:space="preserve">7. Repository layout</w:t>
+        <w:t xml:space="preserve">9. Repository layout</w:t>
       </w:r>
     </w:p>
     <w:p/>
@@ -2644,6 +4736,34 @@
           </w:p>
         </w:tc>
       </w:tr>
+      <w:tr>
+        <w:tc>
+          <w:tcPr>
+            <w:tcBorders>
+              <w:top w:val="single" w:color="CCCCCC" w:sz="1"/>
+              <w:left w:val="single" w:color="CCCCCC" w:sz="1"/>
+              <w:bottom w:val="single" w:color="CCCCCC" w:sz="1"/>
+              <w:right w:val="single" w:color="CCCCCC" w:sz="1"/>
+            </w:tcBorders>
+          </w:tcPr>
+          <w:p>
+            <w:r/>
+          </w:p>
+        </w:tc>
+        <w:tc>
+          <w:tcPr>
+            <w:tcBorders>
+              <w:top w:val="single" w:color="CCCCCC" w:sz="1"/>
+              <w:left w:val="single" w:color="CCCCCC" w:sz="1"/>
+              <w:bottom w:val="single" w:color="CCCCCC" w:sz="1"/>
+              <w:right w:val="single" w:color="CCCCCC" w:sz="1"/>
+            </w:tcBorders>
+          </w:tcPr>
+          <w:p>
+            <w:r/>
+          </w:p>
+        </w:tc>
+      </w:tr>
     </w:tbl>
     <w:p/>
     <w:p/>
@@ -2661,7 +4781,7 @@
         <w:spacing w:before="160" w:after="80"/>
       </w:pPr>
       <w:r>
-        <w:t xml:space="preserve">8. How to run</w:t>
+        <w:t xml:space="preserve">10. How to run</w:t>
       </w:r>
     </w:p>
     <w:p/>
@@ -2803,7 +4923,7 @@
         <w:spacing w:before="160" w:after="80"/>
       </w:pPr>
       <w:r>
-        <w:t xml:space="preserve">9. Change log</w:t>
+        <w:t xml:space="preserve">11. Change log</w:t>
       </w:r>
     </w:p>
     <w:p/>
@@ -2930,6 +5050,88 @@
           </w:p>
         </w:tc>
       </w:tr>
+      <w:tr>
+        <w:tc>
+          <w:tcPr>
+            <w:tcBorders>
+              <w:top w:val="single" w:color="CCCCCC" w:sz="1"/>
+              <w:left w:val="single" w:color="CCCCCC" w:sz="1"/>
+              <w:bottom w:val="single" w:color="CCCCCC" w:sz="1"/>
+              <w:right w:val="single" w:color="CCCCCC" w:sz="1"/>
+            </w:tcBorders>
+          </w:tcPr>
+          <w:p>
+            <w:r/>
+          </w:p>
+        </w:tc>
+        <w:tc>
+          <w:tcPr>
+            <w:tcBorders>
+              <w:top w:val="single" w:color="CCCCCC" w:sz="1"/>
+              <w:left w:val="single" w:color="CCCCCC" w:sz="1"/>
+              <w:bottom w:val="single" w:color="CCCCCC" w:sz="1"/>
+              <w:right w:val="single" w:color="CCCCCC" w:sz="1"/>
+            </w:tcBorders>
+          </w:tcPr>
+          <w:p>
+            <w:r/>
+          </w:p>
+        </w:tc>
+        <w:tc>
+          <w:tcPr>
+            <w:tcBorders>
+              <w:top w:val="single" w:color="CCCCCC" w:sz="1"/>
+              <w:left w:val="single" w:color="CCCCCC" w:sz="1"/>
+              <w:bottom w:val="single" w:color="CCCCCC" w:sz="1"/>
+              <w:right w:val="single" w:color="CCCCCC" w:sz="1"/>
+            </w:tcBorders>
+          </w:tcPr>
+          <w:p>
+            <w:r/>
+          </w:p>
+        </w:tc>
+      </w:tr>
+      <w:tr>
+        <w:tc>
+          <w:tcPr>
+            <w:tcBorders>
+              <w:top w:val="single" w:color="CCCCCC" w:sz="1"/>
+              <w:left w:val="single" w:color="CCCCCC" w:sz="1"/>
+              <w:bottom w:val="single" w:color="CCCCCC" w:sz="1"/>
+              <w:right w:val="single" w:color="CCCCCC" w:sz="1"/>
+            </w:tcBorders>
+          </w:tcPr>
+          <w:p>
+            <w:r/>
+          </w:p>
+        </w:tc>
+        <w:tc>
+          <w:tcPr>
+            <w:tcBorders>
+              <w:top w:val="single" w:color="CCCCCC" w:sz="1"/>
+              <w:left w:val="single" w:color="CCCCCC" w:sz="1"/>
+              <w:bottom w:val="single" w:color="CCCCCC" w:sz="1"/>
+              <w:right w:val="single" w:color="CCCCCC" w:sz="1"/>
+            </w:tcBorders>
+          </w:tcPr>
+          <w:p>
+            <w:r/>
+          </w:p>
+        </w:tc>
+        <w:tc>
+          <w:tcPr>
+            <w:tcBorders>
+              <w:top w:val="single" w:color="CCCCCC" w:sz="1"/>
+              <w:left w:val="single" w:color="CCCCCC" w:sz="1"/>
+              <w:bottom w:val="single" w:color="CCCCCC" w:sz="1"/>
+              <w:right w:val="single" w:color="CCCCCC" w:sz="1"/>
+            </w:tcBorders>
+          </w:tcPr>
+          <w:p>
+            <w:r/>
+          </w:p>
+        </w:tc>
+      </w:tr>
     </w:tbl>
     <w:p/>
     <w:p/>
@@ -2947,7 +5149,7 @@
         <w:spacing w:before="160" w:after="80"/>
       </w:pPr>
       <w:r>
-        <w:t xml:space="preserve">10. Maintenance — keep this document current</w:t>
+        <w:t xml:space="preserve">12. Maintenance — keep this document current</w:t>
       </w:r>
     </w:p>
     <w:p/>
@@ -2988,66 +5190,105 @@
         </w:numPr>
       </w:pPr>
       <w:r>
-        <w:t xml:space="preserve">add, remove, or change a </w:t>
+        <w:t xml:space="preserve">complete or add a </w:t>
       </w:r>
       <w:r>
         <w:rPr>
           <w:b/>
           <w:bCs/>
         </w:rPr>
-        <w:t xml:space="preserve">feature</w:t>
-      </w:r>
-      <w:r>
-        <w:t xml:space="preserve"> → update §4 (move items between</w:t>
-      </w:r>
-    </w:p>
-    <w:p>
-      <w:r>
-        <w:t xml:space="preserve">  implemented/planned) and add a §9 change-log row</w:t>
-      </w:r>
-    </w:p>
-    <w:p>
-      <w:pPr>
-        <w:pStyle w:val="ListParagraph"/>
-        <w:numPr>
-          <w:ilvl w:val="0"/>
-          <w:numId w:val="1"/>
-        </w:numPr>
-      </w:pPr>
-      <w:r>
-        <w:t xml:space="preserve">change the </w:t>
+        <w:t xml:space="preserve">task</w:t>
+      </w:r>
+      <w:r>
+        <w:t xml:space="preserve"> → tick/add it in §4 and add a §11 change-log row</w:t>
+      </w:r>
+    </w:p>
+    <w:p>
+      <w:pPr>
+        <w:pStyle w:val="ListParagraph"/>
+        <w:numPr>
+          <w:ilvl w:val="0"/>
+          <w:numId w:val="1"/>
+        </w:numPr>
+      </w:pPr>
+      <w:r>
+        <w:t xml:space="preserve">add, remove, or change a </w:t>
       </w:r>
       <w:r>
         <w:rPr>
           <w:b/>
           <w:bCs/>
         </w:rPr>
-        <w:t xml:space="preserve">tech stack</w:t>
-      </w:r>
-      <w:r>
-        <w:t xml:space="preserve"> or a major dependency version → update §3</w:t>
-      </w:r>
-    </w:p>
-    <w:p>
-      <w:pPr>
-        <w:pStyle w:val="ListParagraph"/>
-        <w:numPr>
-          <w:ilvl w:val="0"/>
-          <w:numId w:val="1"/>
-        </w:numPr>
-      </w:pPr>
-      <w:r>
-        <w:t xml:space="preserve">change </w:t>
+        <w:t xml:space="preserve">feature</w:t>
+      </w:r>
+      <w:r>
+        <w:t xml:space="preserve"> → update §6 (move between implemented/planned)</w:t>
+      </w:r>
+    </w:p>
+    <w:p>
+      <w:pPr>
+        <w:pStyle w:val="ListParagraph"/>
+        <w:numPr>
+          <w:ilvl w:val="0"/>
+          <w:numId w:val="1"/>
+        </w:numPr>
+      </w:pPr>
+      <w:r>
+        <w:t xml:space="preserve">change a </w:t>
       </w:r>
       <w:r>
         <w:rPr>
           <w:b/>
           <w:bCs/>
         </w:rPr>
+        <w:t xml:space="preserve">phase's status</w:t>
+      </w:r>
+      <w:r>
+        <w:t xml:space="preserve"> → update §3</w:t>
+      </w:r>
+    </w:p>
+    <w:p>
+      <w:pPr>
+        <w:pStyle w:val="ListParagraph"/>
+        <w:numPr>
+          <w:ilvl w:val="0"/>
+          <w:numId w:val="1"/>
+        </w:numPr>
+      </w:pPr>
+      <w:r>
+        <w:t xml:space="preserve">change the </w:t>
+      </w:r>
+      <w:r>
+        <w:rPr>
+          <w:b/>
+          <w:bCs/>
+        </w:rPr>
+        <w:t xml:space="preserve">tech stack</w:t>
+      </w:r>
+      <w:r>
+        <w:t xml:space="preserve"> or a major dependency version → update §5</w:t>
+      </w:r>
+    </w:p>
+    <w:p>
+      <w:pPr>
+        <w:pStyle w:val="ListParagraph"/>
+        <w:numPr>
+          <w:ilvl w:val="0"/>
+          <w:numId w:val="1"/>
+        </w:numPr>
+      </w:pPr>
+      <w:r>
+        <w:t xml:space="preserve">change </w:t>
+      </w:r>
+      <w:r>
+        <w:rPr>
+          <w:b/>
+          <w:bCs/>
+        </w:rPr>
         <w:t xml:space="preserve">scope</w:t>
       </w:r>
       <w:r>
-        <w:t xml:space="preserve"> (something moves in or out of bounds) → update §5</w:t>
+        <w:t xml:space="preserve"> (something moves in or out of bounds) → update §7</w:t>
       </w:r>
     </w:p>
     <w:p>
@@ -3082,7 +5323,7 @@
     </w:p>
     <w:p>
       <w:r>
-        <w:t xml:space="preserve">  and reference it in §6</w:t>
+        <w:t xml:space="preserve">  and reference it in §8</w:t>
       </w:r>
     </w:p>
     <w:p>
@@ -3104,7 +5345,7 @@
         <w:t xml:space="preserve">how to run</w:t>
       </w:r>
       <w:r>
-        <w:t xml:space="preserve"> the project → update §8 and </w:t>
+        <w:t xml:space="preserve"> the project → update §10 and </w:t>
       </w:r>
       <w:r>
         <w:rPr>
@@ -3269,12 +5510,23 @@
     </w:p>
     <w:p>
       <w:r>
-        <w:t xml:space="preserve">generate. Edit the markdown, then regenerate. A Kiro hook also reminds you to</w:t>
-      </w:r>
-    </w:p>
-    <w:p>
-      <w:r>
-        <w:t xml:space="preserve">regenerate when the markdown changes.</w:t>
+        <w:t xml:space="preserve">generate. Edit the markdown, then regenerate. A Kiro hook</w:t>
+      </w:r>
+    </w:p>
+    <w:p>
+      <w:r>
+        <w:t xml:space="preserve">(</w:t>
+      </w:r>
+      <w:r>
+        <w:rPr>
+          <w:sz w:val="20"/>
+          <w:szCs w:val="20"/>
+          <w:rFonts w:ascii="Consolas" w:cs="Consolas" w:eastAsia="Consolas" w:hAnsi="Consolas"/>
+        </w:rPr>
+        <w:t xml:space="preserve">regenerate-report-docx</w:t>
+      </w:r>
+      <w:r>
+        <w:t xml:space="preserve">) also regenerates it when the markdown is saved.</w:t>
       </w:r>
     </w:p>
     <w:p/>

</xml_diff>

<commit_message>
feat(contracts): add npm run reset + idempotent seed (T15)
Add scripts/reset.sh (npm run reset): stops any node on 8545, starts a
fresh local chain, deploys, and seeds -> clean ELIGIBLE state in one
command. Make seed.ts idempotent so re-running skips already-issued
credentials/activity instead of reverting. Update PROJECT-REPORT (task
tracker T15 done, change log, run guide) and regenerate the Word doc.
Gitignore node.log.
</commit_message>
<xml_diff>
--- a/docs/PROJECT-REPORT.docx
+++ b/docs/PROJECT-REPORT.docx
@@ -1969,6 +1969,37 @@
         <w:t xml:space="preserve">T13. Create living project report (markdown + generated Word doc)</w:t>
       </w:r>
     </w:p>
+    <w:p>
+      <w:pPr>
+        <w:pStyle w:val="ListParagraph"/>
+        <w:numPr>
+          <w:ilvl w:val="0"/>
+          <w:numId w:val="1"/>
+        </w:numPr>
+      </w:pPr>
+      <w:r>
+        <w:rPr>
+          <w:b/>
+          <w:bCs/>
+          <w:color w:val="0A7227"/>
+        </w:rPr>
+        <w:t xml:space="preserve">✓ </w:t>
+      </w:r>
+      <w:r>
+        <w:t xml:space="preserve">T15. Add a single </w:t>
+      </w:r>
+      <w:r>
+        <w:rPr>
+          <w:sz w:val="20"/>
+          <w:szCs w:val="20"/>
+          <w:rFonts w:ascii="Consolas" w:cs="Consolas" w:eastAsia="Consolas" w:hAnsi="Consolas"/>
+        </w:rPr>
+        <w:t xml:space="preserve">npm run reset</w:t>
+      </w:r>
+      <w:r>
+        <w:t xml:space="preserve"> convenience for the demo (fresh node + deploy + seed); made seed idempotent</w:t>
+      </w:r>
+    </w:p>
     <w:p/>
     <w:p>
       <w:pPr>
@@ -2024,37 +2055,6 @@
       </w:r>
       <w:r>
         <w:t xml:space="preserve">.</w:t>
-      </w:r>
-    </w:p>
-    <w:p>
-      <w:pPr>
-        <w:pStyle w:val="ListParagraph"/>
-        <w:numPr>
-          <w:ilvl w:val="0"/>
-          <w:numId w:val="1"/>
-        </w:numPr>
-      </w:pPr>
-      <w:r>
-        <w:rPr>
-          <w:b/>
-          <w:bCs/>
-          <w:color w:val="B4232C"/>
-        </w:rPr>
-        <w:t xml:space="preserve">☐ </w:t>
-      </w:r>
-      <w:r>
-        <w:t xml:space="preserve">T15. Add a single </w:t>
-      </w:r>
-      <w:r>
-        <w:rPr>
-          <w:sz w:val="20"/>
-          <w:szCs w:val="20"/>
-          <w:rFonts w:ascii="Consolas" w:cs="Consolas" w:eastAsia="Consolas" w:hAnsi="Consolas"/>
-        </w:rPr>
-        <w:t xml:space="preserve">npm run reset</w:t>
-      </w:r>
-      <w:r>
-        <w:t xml:space="preserve"> convenience for the demo (deploy + seed)</w:t>
       </w:r>
     </w:p>
     <w:p>
@@ -4892,9 +4892,43 @@
         <w:t xml:space="preserve">Demo: activity shows ELIGIBLE → click "Revoke crane inspection" → NOT ELIGIBLE.</w:t>
       </w:r>
     </w:p>
-    <w:p>
-      <w:r>
-        <w:t xml:space="preserve">Reset: restart node, then </w:t>
+    <w:p/>
+    <w:p>
+      <w:r>
+        <w:rPr>
+          <w:b/>
+          <w:bCs/>
+        </w:rPr>
+        <w:t xml:space="preserve">Reset to a clean ELIGIBLE state</w:t>
+      </w:r>
+      <w:r>
+        <w:t xml:space="preserve"> (one command — fresh node + deploy + seed):</w:t>
+      </w:r>
+    </w:p>
+    <w:p/>
+    <w:p>
+      <w:pPr>
+        <w:shd w:fill="0D1117"/>
+      </w:pPr>
+      <w:r>
+        <w:rPr>
+          <w:color w:val="C9D1D9"/>
+          <w:sz w:val="18"/>
+          <w:szCs w:val="18"/>
+          <w:rFonts w:ascii="Consolas" w:cs="Consolas" w:eastAsia="Consolas" w:hAnsi="Consolas"/>
+        </w:rPr>
+        <w:t xml:space="preserve">cd contracts &amp;&amp; npm run reset</w:t>
+      </w:r>
+    </w:p>
+    <w:p/>
+    <w:p>
+      <w:r>
+        <w:t xml:space="preserve">Then refresh the web app. (A revoked credential cannot be un-revoked by design,</w:t>
+      </w:r>
+    </w:p>
+    <w:p>
+      <w:r>
+        <w:t xml:space="preserve">so a full reset needs a fresh contract — which </w:t>
       </w:r>
       <w:r>
         <w:rPr>
@@ -4902,10 +4936,10 @@
           <w:szCs w:val="20"/>
           <w:rFonts w:ascii="Consolas" w:cs="Consolas" w:eastAsia="Consolas" w:hAnsi="Consolas"/>
         </w:rPr>
-        <w:t xml:space="preserve">npm run deploy &amp;&amp; npm run seed</w:t>
-      </w:r>
-      <w:r>
-        <w:t xml:space="preserve">.</w:t>
+        <w:t xml:space="preserve">reset</w:t>
+      </w:r>
+      <w:r>
+        <w:t xml:space="preserve"> handles for you.)</w:t>
       </w:r>
     </w:p>
     <w:p/>
@@ -5006,6 +5040,49 @@
                 <w:bCs/>
               </w:rPr>
             </w:r>
+          </w:p>
+        </w:tc>
+      </w:tr>
+      <w:tr>
+        <w:tc>
+          <w:tcPr>
+            <w:tcBorders>
+              <w:top w:val="single" w:color="CCCCCC" w:sz="1"/>
+              <w:left w:val="single" w:color="CCCCCC" w:sz="1"/>
+              <w:bottom w:val="single" w:color="CCCCCC" w:sz="1"/>
+              <w:right w:val="single" w:color="CCCCCC" w:sz="1"/>
+            </w:tcBorders>
+          </w:tcPr>
+          <w:p>
+            <w:r/>
+          </w:p>
+        </w:tc>
+        <w:tc>
+          <w:tcPr>
+            <w:tcBorders>
+              <w:top w:val="single" w:color="CCCCCC" w:sz="1"/>
+              <w:left w:val="single" w:color="CCCCCC" w:sz="1"/>
+              <w:bottom w:val="single" w:color="CCCCCC" w:sz="1"/>
+              <w:right w:val="single" w:color="CCCCCC" w:sz="1"/>
+            </w:tcBorders>
+          </w:tcPr>
+          <w:p>
+            <w:r/>
+            <w:r/>
+            <w:r/>
+          </w:p>
+        </w:tc>
+        <w:tc>
+          <w:tcPr>
+            <w:tcBorders>
+              <w:top w:val="single" w:color="CCCCCC" w:sz="1"/>
+              <w:left w:val="single" w:color="CCCCCC" w:sz="1"/>
+              <w:bottom w:val="single" w:color="CCCCCC" w:sz="1"/>
+              <w:right w:val="single" w:color="CCCCCC" w:sz="1"/>
+            </w:tcBorders>
+          </w:tcPr>
+          <w:p>
+            <w:r/>
           </w:p>
         </w:tc>
       </w:tr>

</xml_diff>

<commit_message>
feat(web): off-chain data layer with Supabase + local fallback (T16)
Add an off-chain data layer backing the UI:
- supabase.ts: client that activates only when VITE_SUPABASE_URL/ANON_KEY
  are set; otherwise dataSource='local'.
- types.ts: types mirroring db/schema.sql.
- data.ts: async data access (credentials/workers/machines/documents/
  activities) with a local in-memory store seeded to mirror the on-chain
  demo; on_chain_id links each record to its blockchain credential.
- App.tsx: new panel showing off-chain metadata joined to on-chain status,
  plus a data-source badge.
- db/seed.sql: Supabase demo seed matching the on-chain data.

Verified: build/type-check pass; on_chain_id values match ethers.id and
resolve to valid on-chain credentials. Report updated (T16 done, F13
added, stack, change log) and Word doc regenerated.
</commit_message>
<xml_diff>
--- a/docs/PROJECT-REPORT.docx
+++ b/docs/PROJECT-REPORT.docx
@@ -2000,6 +2000,26 @@
         <w:t xml:space="preserve"> convenience for the demo (fresh node + deploy + seed); made seed idempotent</w:t>
       </w:r>
     </w:p>
+    <w:p>
+      <w:pPr>
+        <w:pStyle w:val="ListParagraph"/>
+        <w:numPr>
+          <w:ilvl w:val="0"/>
+          <w:numId w:val="1"/>
+        </w:numPr>
+      </w:pPr>
+      <w:r>
+        <w:rPr>
+          <w:b/>
+          <w:bCs/>
+          <w:color w:val="0A7227"/>
+        </w:rPr>
+        <w:t xml:space="preserve">✓ </w:t>
+      </w:r>
+      <w:r>
+        <w:t xml:space="preserve">T16. Wire the UI to an off-chain data layer (Supabase + local fallback), with a panel joining off-chain metadata to on-chain status</w:t>
+      </w:r>
+    </w:p>
     <w:p/>
     <w:p>
       <w:pPr>
@@ -2055,37 +2075,6 @@
       </w:r>
       <w:r>
         <w:t xml:space="preserve">.</w:t>
-      </w:r>
-    </w:p>
-    <w:p>
-      <w:pPr>
-        <w:pStyle w:val="ListParagraph"/>
-        <w:numPr>
-          <w:ilvl w:val="0"/>
-          <w:numId w:val="1"/>
-        </w:numPr>
-      </w:pPr>
-      <w:r>
-        <w:rPr>
-          <w:b/>
-          <w:bCs/>
-          <w:color w:val="B4232C"/>
-        </w:rPr>
-        <w:t xml:space="preserve">☐ </w:t>
-      </w:r>
-      <w:r>
-        <w:t xml:space="preserve">T16. Wire the UI to Supabase for off-chain metadata (schema in </w:t>
-      </w:r>
-      <w:r>
-        <w:rPr>
-          <w:sz w:val="20"/>
-          <w:szCs w:val="20"/>
-          <w:rFonts w:ascii="Consolas" w:cs="Consolas" w:eastAsia="Consolas" w:hAnsi="Consolas"/>
-        </w:rPr>
-        <w:t xml:space="preserve">db/schema.sql</w:t>
-      </w:r>
-      <w:r>
-        <w:t xml:space="preserve">)</w:t>
       </w:r>
     </w:p>
     <w:p>
@@ -2811,6 +2800,8 @@
             </w:tcBorders>
           </w:tcPr>
           <w:p>
+            <w:r/>
+            <w:r/>
             <w:r/>
           </w:p>
         </w:tc>
@@ -3645,6 +3636,64 @@
           </w:p>
         </w:tc>
       </w:tr>
+      <w:tr>
+        <w:tc>
+          <w:tcPr>
+            <w:tcBorders>
+              <w:top w:val="single" w:color="CCCCCC" w:sz="1"/>
+              <w:left w:val="single" w:color="CCCCCC" w:sz="1"/>
+              <w:bottom w:val="single" w:color="CCCCCC" w:sz="1"/>
+              <w:right w:val="single" w:color="CCCCCC" w:sz="1"/>
+            </w:tcBorders>
+          </w:tcPr>
+          <w:p>
+            <w:r/>
+          </w:p>
+        </w:tc>
+        <w:tc>
+          <w:tcPr>
+            <w:tcBorders>
+              <w:top w:val="single" w:color="CCCCCC" w:sz="1"/>
+              <w:left w:val="single" w:color="CCCCCC" w:sz="1"/>
+              <w:bottom w:val="single" w:color="CCCCCC" w:sz="1"/>
+              <w:right w:val="single" w:color="CCCCCC" w:sz="1"/>
+            </w:tcBorders>
+          </w:tcPr>
+          <w:p>
+            <w:r/>
+          </w:p>
+        </w:tc>
+        <w:tc>
+          <w:tcPr>
+            <w:tcBorders>
+              <w:top w:val="single" w:color="CCCCCC" w:sz="1"/>
+              <w:left w:val="single" w:color="CCCCCC" w:sz="1"/>
+              <w:bottom w:val="single" w:color="CCCCCC" w:sz="1"/>
+              <w:right w:val="single" w:color="CCCCCC" w:sz="1"/>
+            </w:tcBorders>
+          </w:tcPr>
+          <w:p>
+            <w:r/>
+            <w:r/>
+            <w:r/>
+            <w:r/>
+            <w:r/>
+          </w:p>
+        </w:tc>
+        <w:tc>
+          <w:tcPr>
+            <w:tcBorders>
+              <w:top w:val="single" w:color="CCCCCC" w:sz="1"/>
+              <w:left w:val="single" w:color="CCCCCC" w:sz="1"/>
+              <w:bottom w:val="single" w:color="CCCCCC" w:sz="1"/>
+              <w:right w:val="single" w:color="CCCCCC" w:sz="1"/>
+            </w:tcBorders>
+          </w:tcPr>
+          <w:p>
+            <w:r/>
+          </w:p>
+        </w:tc>
+      </w:tr>
     </w:tbl>
     <w:p/>
     <w:p/>
@@ -3806,61 +3855,6 @@
           <w:p>
             <w:r/>
             <w:r/>
-          </w:p>
-        </w:tc>
-      </w:tr>
-      <w:tr>
-        <w:tc>
-          <w:tcPr>
-            <w:tcBorders>
-              <w:top w:val="single" w:color="CCCCCC" w:sz="1"/>
-              <w:left w:val="single" w:color="CCCCCC" w:sz="1"/>
-              <w:bottom w:val="single" w:color="CCCCCC" w:sz="1"/>
-              <w:right w:val="single" w:color="CCCCCC" w:sz="1"/>
-            </w:tcBorders>
-          </w:tcPr>
-          <w:p>
-            <w:r/>
-          </w:p>
-        </w:tc>
-        <w:tc>
-          <w:tcPr>
-            <w:tcBorders>
-              <w:top w:val="single" w:color="CCCCCC" w:sz="1"/>
-              <w:left w:val="single" w:color="CCCCCC" w:sz="1"/>
-              <w:bottom w:val="single" w:color="CCCCCC" w:sz="1"/>
-              <w:right w:val="single" w:color="CCCCCC" w:sz="1"/>
-            </w:tcBorders>
-          </w:tcPr>
-          <w:p>
-            <w:r/>
-          </w:p>
-        </w:tc>
-        <w:tc>
-          <w:tcPr>
-            <w:tcBorders>
-              <w:top w:val="single" w:color="CCCCCC" w:sz="1"/>
-              <w:left w:val="single" w:color="CCCCCC" w:sz="1"/>
-              <w:bottom w:val="single" w:color="CCCCCC" w:sz="1"/>
-              <w:right w:val="single" w:color="CCCCCC" w:sz="1"/>
-            </w:tcBorders>
-          </w:tcPr>
-          <w:p>
-            <w:r/>
-          </w:p>
-        </w:tc>
-        <w:tc>
-          <w:tcPr>
-            <w:tcBorders>
-              <w:top w:val="single" w:color="CCCCCC" w:sz="1"/>
-              <w:left w:val="single" w:color="CCCCCC" w:sz="1"/>
-              <w:bottom w:val="single" w:color="CCCCCC" w:sz="1"/>
-              <w:right w:val="single" w:color="CCCCCC" w:sz="1"/>
-            </w:tcBorders>
-          </w:tcPr>
-          <w:p>
-            <w:r/>
-            <w:r/>
             <w:r/>
           </w:p>
         </w:tc>
@@ -5040,6 +5034,49 @@
                 <w:bCs/>
               </w:rPr>
             </w:r>
+          </w:p>
+        </w:tc>
+      </w:tr>
+      <w:tr>
+        <w:tc>
+          <w:tcPr>
+            <w:tcBorders>
+              <w:top w:val="single" w:color="CCCCCC" w:sz="1"/>
+              <w:left w:val="single" w:color="CCCCCC" w:sz="1"/>
+              <w:bottom w:val="single" w:color="CCCCCC" w:sz="1"/>
+              <w:right w:val="single" w:color="CCCCCC" w:sz="1"/>
+            </w:tcBorders>
+          </w:tcPr>
+          <w:p>
+            <w:r/>
+          </w:p>
+        </w:tc>
+        <w:tc>
+          <w:tcPr>
+            <w:tcBorders>
+              <w:top w:val="single" w:color="CCCCCC" w:sz="1"/>
+              <w:left w:val="single" w:color="CCCCCC" w:sz="1"/>
+              <w:bottom w:val="single" w:color="CCCCCC" w:sz="1"/>
+              <w:right w:val="single" w:color="CCCCCC" w:sz="1"/>
+            </w:tcBorders>
+          </w:tcPr>
+          <w:p>
+            <w:r/>
+            <w:r/>
+            <w:r/>
+          </w:p>
+        </w:tc>
+        <w:tc>
+          <w:tcPr>
+            <w:tcBorders>
+              <w:top w:val="single" w:color="CCCCCC" w:sz="1"/>
+              <w:left w:val="single" w:color="CCCCCC" w:sz="1"/>
+              <w:bottom w:val="single" w:color="CCCCCC" w:sz="1"/>
+              <w:right w:val="single" w:color="CCCCCC" w:sz="1"/>
+            </w:tcBorders>
+          </w:tcPr>
+          <w:p>
+            <w:r/>
           </w:p>
         </w:tc>
       </w:tr>

</xml_diff>

<commit_message>
feat(web): document upload + SHA-256 tamper detection (T17)
Add browser-side SHA-256 hashing (Web Crypto) and on-chain tamper
verification:
- lib/docs.ts: sha256Bytes32(file), registerDocument(hash) (issues a
  credential carrying the file hash), verifyDocument(id, hash).
- DocumentPanel.tsx: register a file then verify a file -> DOCUMENT INTACT
  or DOCUMENT ALTERED. The document never leaves the browser; only its
  32-byte hash is stored on-chain.
Update PROJECT-REPORT (T17 done, F14 added, change log) and regenerate the
Word doc.

Note: recovered the full project from GitHub after the local working
directory was externally wiped mid-task; no committed work was lost.
</commit_message>
<xml_diff>
--- a/docs/PROJECT-REPORT.docx
+++ b/docs/PROJECT-REPORT.docx
@@ -2020,6 +2020,37 @@
         <w:t xml:space="preserve">T16. Wire the UI to an off-chain data layer (Supabase + local fallback), with a panel joining off-chain metadata to on-chain status</w:t>
       </w:r>
     </w:p>
+    <w:p>
+      <w:pPr>
+        <w:pStyle w:val="ListParagraph"/>
+        <w:numPr>
+          <w:ilvl w:val="0"/>
+          <w:numId w:val="1"/>
+        </w:numPr>
+      </w:pPr>
+      <w:r>
+        <w:rPr>
+          <w:b/>
+          <w:bCs/>
+          <w:color w:val="0A7227"/>
+        </w:rPr>
+        <w:t xml:space="preserve">✓ </w:t>
+      </w:r>
+      <w:r>
+        <w:t xml:space="preserve">T17. Document upload + SHA-256 hashing in the UI, verified against on-chain </w:t>
+      </w:r>
+      <w:r>
+        <w:rPr>
+          <w:sz w:val="20"/>
+          <w:szCs w:val="20"/>
+          <w:rFonts w:ascii="Consolas" w:cs="Consolas" w:eastAsia="Consolas" w:hAnsi="Consolas"/>
+        </w:rPr>
+        <w:t xml:space="preserve">verifyDocument</w:t>
+      </w:r>
+      <w:r>
+        <w:t xml:space="preserve"> (DOCUMENT INTACT / ALTERED)</w:t>
+      </w:r>
+    </w:p>
     <w:p/>
     <w:p>
       <w:pPr>
@@ -2075,26 +2106,6 @@
       </w:r>
       <w:r>
         <w:t xml:space="preserve">.</w:t>
-      </w:r>
-    </w:p>
-    <w:p>
-      <w:pPr>
-        <w:pStyle w:val="ListParagraph"/>
-        <w:numPr>
-          <w:ilvl w:val="0"/>
-          <w:numId w:val="1"/>
-        </w:numPr>
-      </w:pPr>
-      <w:r>
-        <w:rPr>
-          <w:b/>
-          <w:bCs/>
-          <w:color w:val="B4232C"/>
-        </w:rPr>
-        <w:t xml:space="preserve">☐ </w:t>
-      </w:r>
-      <w:r>
-        <w:t xml:space="preserve">T17. Document upload + SHA-256 hashing from the UI (contract support exists)</w:t>
       </w:r>
     </w:p>
     <w:p>
@@ -3694,6 +3705,62 @@
           </w:p>
         </w:tc>
       </w:tr>
+      <w:tr>
+        <w:tc>
+          <w:tcPr>
+            <w:tcBorders>
+              <w:top w:val="single" w:color="CCCCCC" w:sz="1"/>
+              <w:left w:val="single" w:color="CCCCCC" w:sz="1"/>
+              <w:bottom w:val="single" w:color="CCCCCC" w:sz="1"/>
+              <w:right w:val="single" w:color="CCCCCC" w:sz="1"/>
+            </w:tcBorders>
+          </w:tcPr>
+          <w:p>
+            <w:r/>
+          </w:p>
+        </w:tc>
+        <w:tc>
+          <w:tcPr>
+            <w:tcBorders>
+              <w:top w:val="single" w:color="CCCCCC" w:sz="1"/>
+              <w:left w:val="single" w:color="CCCCCC" w:sz="1"/>
+              <w:bottom w:val="single" w:color="CCCCCC" w:sz="1"/>
+              <w:right w:val="single" w:color="CCCCCC" w:sz="1"/>
+            </w:tcBorders>
+          </w:tcPr>
+          <w:p>
+            <w:r/>
+          </w:p>
+        </w:tc>
+        <w:tc>
+          <w:tcPr>
+            <w:tcBorders>
+              <w:top w:val="single" w:color="CCCCCC" w:sz="1"/>
+              <w:left w:val="single" w:color="CCCCCC" w:sz="1"/>
+              <w:bottom w:val="single" w:color="CCCCCC" w:sz="1"/>
+              <w:right w:val="single" w:color="CCCCCC" w:sz="1"/>
+            </w:tcBorders>
+          </w:tcPr>
+          <w:p>
+            <w:r/>
+            <w:r/>
+            <w:r/>
+          </w:p>
+        </w:tc>
+        <w:tc>
+          <w:tcPr>
+            <w:tcBorders>
+              <w:top w:val="single" w:color="CCCCCC" w:sz="1"/>
+              <w:left w:val="single" w:color="CCCCCC" w:sz="1"/>
+              <w:bottom w:val="single" w:color="CCCCCC" w:sz="1"/>
+              <w:right w:val="single" w:color="CCCCCC" w:sz="1"/>
+            </w:tcBorders>
+          </w:tcPr>
+          <w:p>
+            <w:r/>
+          </w:p>
+        </w:tc>
+      </w:tr>
     </w:tbl>
     <w:p/>
     <w:p/>
@@ -3854,62 +3921,6 @@
           </w:tcPr>
           <w:p>
             <w:r/>
-            <w:r/>
-            <w:r/>
-          </w:p>
-        </w:tc>
-      </w:tr>
-      <w:tr>
-        <w:tc>
-          <w:tcPr>
-            <w:tcBorders>
-              <w:top w:val="single" w:color="CCCCCC" w:sz="1"/>
-              <w:left w:val="single" w:color="CCCCCC" w:sz="1"/>
-              <w:bottom w:val="single" w:color="CCCCCC" w:sz="1"/>
-              <w:right w:val="single" w:color="CCCCCC" w:sz="1"/>
-            </w:tcBorders>
-          </w:tcPr>
-          <w:p>
-            <w:r/>
-          </w:p>
-        </w:tc>
-        <w:tc>
-          <w:tcPr>
-            <w:tcBorders>
-              <w:top w:val="single" w:color="CCCCCC" w:sz="1"/>
-              <w:left w:val="single" w:color="CCCCCC" w:sz="1"/>
-              <w:bottom w:val="single" w:color="CCCCCC" w:sz="1"/>
-              <w:right w:val="single" w:color="CCCCCC" w:sz="1"/>
-            </w:tcBorders>
-          </w:tcPr>
-          <w:p>
-            <w:r/>
-          </w:p>
-        </w:tc>
-        <w:tc>
-          <w:tcPr>
-            <w:tcBorders>
-              <w:top w:val="single" w:color="CCCCCC" w:sz="1"/>
-              <w:left w:val="single" w:color="CCCCCC" w:sz="1"/>
-              <w:bottom w:val="single" w:color="CCCCCC" w:sz="1"/>
-              <w:right w:val="single" w:color="CCCCCC" w:sz="1"/>
-            </w:tcBorders>
-          </w:tcPr>
-          <w:p>
-            <w:r/>
-          </w:p>
-        </w:tc>
-        <w:tc>
-          <w:tcPr>
-            <w:tcBorders>
-              <w:top w:val="single" w:color="CCCCCC" w:sz="1"/>
-              <w:left w:val="single" w:color="CCCCCC" w:sz="1"/>
-              <w:bottom w:val="single" w:color="CCCCCC" w:sz="1"/>
-              <w:right w:val="single" w:color="CCCCCC" w:sz="1"/>
-            </w:tcBorders>
-          </w:tcPr>
-          <w:p>
-            <w:r/>
           </w:p>
         </w:tc>
       </w:tr>
@@ -5034,6 +5045,47 @@
                 <w:bCs/>
               </w:rPr>
             </w:r>
+          </w:p>
+        </w:tc>
+      </w:tr>
+      <w:tr>
+        <w:tc>
+          <w:tcPr>
+            <w:tcBorders>
+              <w:top w:val="single" w:color="CCCCCC" w:sz="1"/>
+              <w:left w:val="single" w:color="CCCCCC" w:sz="1"/>
+              <w:bottom w:val="single" w:color="CCCCCC" w:sz="1"/>
+              <w:right w:val="single" w:color="CCCCCC" w:sz="1"/>
+            </w:tcBorders>
+          </w:tcPr>
+          <w:p>
+            <w:r/>
+          </w:p>
+        </w:tc>
+        <w:tc>
+          <w:tcPr>
+            <w:tcBorders>
+              <w:top w:val="single" w:color="CCCCCC" w:sz="1"/>
+              <w:left w:val="single" w:color="CCCCCC" w:sz="1"/>
+              <w:bottom w:val="single" w:color="CCCCCC" w:sz="1"/>
+              <w:right w:val="single" w:color="CCCCCC" w:sz="1"/>
+            </w:tcBorders>
+          </w:tcPr>
+          <w:p>
+            <w:r/>
+          </w:p>
+        </w:tc>
+        <w:tc>
+          <w:tcPr>
+            <w:tcBorders>
+              <w:top w:val="single" w:color="CCCCCC" w:sz="1"/>
+              <w:left w:val="single" w:color="CCCCCC" w:sz="1"/>
+              <w:bottom w:val="single" w:color="CCCCCC" w:sz="1"/>
+              <w:right w:val="single" w:color="CCCCCC" w:sz="1"/>
+            </w:tcBorders>
+          </w:tcPr>
+          <w:p>
+            <w:r/>
           </w:p>
         </w:tc>
       </w:tr>

</xml_diff>

<commit_message>
feat(web): issuer & contractor dashboards (T18, T19)
Create credentials and lifting activities from the UI instead of only via
the seed script:
- data.ts: addCredential, addActivity, ensureHolder (Supabase-or-local).
- IssuerDashboard.tsx: form to issue a credential (id, type, holder,
  expiry) -> issueCredential on-chain + addCredential off-chain.
- ContractorDashboard.tsx: form to create an activity selecting required
  credentials -> createActivity on-chain + addActivity off-chain.
Both wired into App.tsx; refresh after writes. Verified on-chain: a
UI-issued credential is valid and a UI-created activity is eligible.
T19 (tamper-detection screen) marked done — delivered by T17 DocumentPanel.
Report updated (T18/T19 done, F15 added) and Word doc regenerated.
</commit_message>
<xml_diff>
--- a/docs/PROJECT-REPORT.docx
+++ b/docs/PROJECT-REPORT.docx
@@ -2051,6 +2051,46 @@
         <w:t xml:space="preserve"> (DOCUMENT INTACT / ALTERED)</w:t>
       </w:r>
     </w:p>
+    <w:p>
+      <w:pPr>
+        <w:pStyle w:val="ListParagraph"/>
+        <w:numPr>
+          <w:ilvl w:val="0"/>
+          <w:numId w:val="1"/>
+        </w:numPr>
+      </w:pPr>
+      <w:r>
+        <w:rPr>
+          <w:b/>
+          <w:bCs/>
+          <w:color w:val="0A7227"/>
+        </w:rPr>
+        <w:t xml:space="preserve">✓ </w:t>
+      </w:r>
+      <w:r>
+        <w:t xml:space="preserve">T18. Issuer &amp; contractor dashboards — issue credentials and create activities from the UI (on-chain + off-chain)</w:t>
+      </w:r>
+    </w:p>
+    <w:p>
+      <w:pPr>
+        <w:pStyle w:val="ListParagraph"/>
+        <w:numPr>
+          <w:ilvl w:val="0"/>
+          <w:numId w:val="1"/>
+        </w:numPr>
+      </w:pPr>
+      <w:r>
+        <w:rPr>
+          <w:b/>
+          <w:bCs/>
+          <w:color w:val="0A7227"/>
+        </w:rPr>
+        <w:t xml:space="preserve">✓ </w:t>
+      </w:r>
+      <w:r>
+        <w:t xml:space="preserve">T19. Tamper-detection screen in the UI (delivered by the T17 DocumentPanel)</w:t>
+      </w:r>
+    </w:p>
     <w:p/>
     <w:p>
       <w:pPr>
@@ -2106,46 +2146,6 @@
       </w:r>
       <w:r>
         <w:t xml:space="preserve">.</w:t>
-      </w:r>
-    </w:p>
-    <w:p>
-      <w:pPr>
-        <w:pStyle w:val="ListParagraph"/>
-        <w:numPr>
-          <w:ilvl w:val="0"/>
-          <w:numId w:val="1"/>
-        </w:numPr>
-      </w:pPr>
-      <w:r>
-        <w:rPr>
-          <w:b/>
-          <w:bCs/>
-          <w:color w:val="B4232C"/>
-        </w:rPr>
-        <w:t xml:space="preserve">☐ </w:t>
-      </w:r>
-      <w:r>
-        <w:t xml:space="preserve">T18. Issuer/contractor dashboards to create credentials &amp; activities from the UI</w:t>
-      </w:r>
-    </w:p>
-    <w:p>
-      <w:pPr>
-        <w:pStyle w:val="ListParagraph"/>
-        <w:numPr>
-          <w:ilvl w:val="0"/>
-          <w:numId w:val="1"/>
-        </w:numPr>
-      </w:pPr>
-      <w:r>
-        <w:rPr>
-          <w:b/>
-          <w:bCs/>
-          <w:color w:val="B4232C"/>
-        </w:rPr>
-        <w:t xml:space="preserve">☐ </w:t>
-      </w:r>
-      <w:r>
-        <w:t xml:space="preserve">T19. Tamper-detection screen in the UI</w:t>
       </w:r>
     </w:p>
     <w:p>
@@ -3761,6 +3761,62 @@
           </w:p>
         </w:tc>
       </w:tr>
+      <w:tr>
+        <w:tc>
+          <w:tcPr>
+            <w:tcBorders>
+              <w:top w:val="single" w:color="CCCCCC" w:sz="1"/>
+              <w:left w:val="single" w:color="CCCCCC" w:sz="1"/>
+              <w:bottom w:val="single" w:color="CCCCCC" w:sz="1"/>
+              <w:right w:val="single" w:color="CCCCCC" w:sz="1"/>
+            </w:tcBorders>
+          </w:tcPr>
+          <w:p>
+            <w:r/>
+          </w:p>
+        </w:tc>
+        <w:tc>
+          <w:tcPr>
+            <w:tcBorders>
+              <w:top w:val="single" w:color="CCCCCC" w:sz="1"/>
+              <w:left w:val="single" w:color="CCCCCC" w:sz="1"/>
+              <w:bottom w:val="single" w:color="CCCCCC" w:sz="1"/>
+              <w:right w:val="single" w:color="CCCCCC" w:sz="1"/>
+            </w:tcBorders>
+          </w:tcPr>
+          <w:p>
+            <w:r/>
+          </w:p>
+        </w:tc>
+        <w:tc>
+          <w:tcPr>
+            <w:tcBorders>
+              <w:top w:val="single" w:color="CCCCCC" w:sz="1"/>
+              <w:left w:val="single" w:color="CCCCCC" w:sz="1"/>
+              <w:bottom w:val="single" w:color="CCCCCC" w:sz="1"/>
+              <w:right w:val="single" w:color="CCCCCC" w:sz="1"/>
+            </w:tcBorders>
+          </w:tcPr>
+          <w:p>
+            <w:r/>
+            <w:r/>
+            <w:r/>
+          </w:p>
+        </w:tc>
+        <w:tc>
+          <w:tcPr>
+            <w:tcBorders>
+              <w:top w:val="single" w:color="CCCCCC" w:sz="1"/>
+              <w:left w:val="single" w:color="CCCCCC" w:sz="1"/>
+              <w:bottom w:val="single" w:color="CCCCCC" w:sz="1"/>
+              <w:right w:val="single" w:color="CCCCCC" w:sz="1"/>
+            </w:tcBorders>
+          </w:tcPr>
+          <w:p>
+            <w:r/>
+          </w:p>
+        </w:tc>
+      </w:tr>
     </w:tbl>
     <w:p/>
     <w:p/>
@@ -3921,114 +3977,6 @@
           </w:tcPr>
           <w:p>
             <w:r/>
-          </w:p>
-        </w:tc>
-      </w:tr>
-      <w:tr>
-        <w:tc>
-          <w:tcPr>
-            <w:tcBorders>
-              <w:top w:val="single" w:color="CCCCCC" w:sz="1"/>
-              <w:left w:val="single" w:color="CCCCCC" w:sz="1"/>
-              <w:bottom w:val="single" w:color="CCCCCC" w:sz="1"/>
-              <w:right w:val="single" w:color="CCCCCC" w:sz="1"/>
-            </w:tcBorders>
-          </w:tcPr>
-          <w:p>
-            <w:r/>
-          </w:p>
-        </w:tc>
-        <w:tc>
-          <w:tcPr>
-            <w:tcBorders>
-              <w:top w:val="single" w:color="CCCCCC" w:sz="1"/>
-              <w:left w:val="single" w:color="CCCCCC" w:sz="1"/>
-              <w:bottom w:val="single" w:color="CCCCCC" w:sz="1"/>
-              <w:right w:val="single" w:color="CCCCCC" w:sz="1"/>
-            </w:tcBorders>
-          </w:tcPr>
-          <w:p>
-            <w:r/>
-          </w:p>
-        </w:tc>
-        <w:tc>
-          <w:tcPr>
-            <w:tcBorders>
-              <w:top w:val="single" w:color="CCCCCC" w:sz="1"/>
-              <w:left w:val="single" w:color="CCCCCC" w:sz="1"/>
-              <w:bottom w:val="single" w:color="CCCCCC" w:sz="1"/>
-              <w:right w:val="single" w:color="CCCCCC" w:sz="1"/>
-            </w:tcBorders>
-          </w:tcPr>
-          <w:p>
-            <w:r/>
-          </w:p>
-        </w:tc>
-        <w:tc>
-          <w:tcPr>
-            <w:tcBorders>
-              <w:top w:val="single" w:color="CCCCCC" w:sz="1"/>
-              <w:left w:val="single" w:color="CCCCCC" w:sz="1"/>
-              <w:bottom w:val="single" w:color="CCCCCC" w:sz="1"/>
-              <w:right w:val="single" w:color="CCCCCC" w:sz="1"/>
-            </w:tcBorders>
-          </w:tcPr>
-          <w:p>
-            <w:r/>
-            <w:r/>
-          </w:p>
-        </w:tc>
-      </w:tr>
-      <w:tr>
-        <w:tc>
-          <w:tcPr>
-            <w:tcBorders>
-              <w:top w:val="single" w:color="CCCCCC" w:sz="1"/>
-              <w:left w:val="single" w:color="CCCCCC" w:sz="1"/>
-              <w:bottom w:val="single" w:color="CCCCCC" w:sz="1"/>
-              <w:right w:val="single" w:color="CCCCCC" w:sz="1"/>
-            </w:tcBorders>
-          </w:tcPr>
-          <w:p>
-            <w:r/>
-          </w:p>
-        </w:tc>
-        <w:tc>
-          <w:tcPr>
-            <w:tcBorders>
-              <w:top w:val="single" w:color="CCCCCC" w:sz="1"/>
-              <w:left w:val="single" w:color="CCCCCC" w:sz="1"/>
-              <w:bottom w:val="single" w:color="CCCCCC" w:sz="1"/>
-              <w:right w:val="single" w:color="CCCCCC" w:sz="1"/>
-            </w:tcBorders>
-          </w:tcPr>
-          <w:p>
-            <w:r/>
-          </w:p>
-        </w:tc>
-        <w:tc>
-          <w:tcPr>
-            <w:tcBorders>
-              <w:top w:val="single" w:color="CCCCCC" w:sz="1"/>
-              <w:left w:val="single" w:color="CCCCCC" w:sz="1"/>
-              <w:bottom w:val="single" w:color="CCCCCC" w:sz="1"/>
-              <w:right w:val="single" w:color="CCCCCC" w:sz="1"/>
-            </w:tcBorders>
-          </w:tcPr>
-          <w:p>
-            <w:r/>
-          </w:p>
-        </w:tc>
-        <w:tc>
-          <w:tcPr>
-            <w:tcBorders>
-              <w:top w:val="single" w:color="CCCCCC" w:sz="1"/>
-              <w:left w:val="single" w:color="CCCCCC" w:sz="1"/>
-              <w:bottom w:val="single" w:color="CCCCCC" w:sz="1"/>
-              <w:right w:val="single" w:color="CCCCCC" w:sz="1"/>
-            </w:tcBorders>
-          </w:tcPr>
-          <w:p>
             <w:r/>
           </w:p>
         </w:tc>
@@ -5045,6 +4993,47 @@
                 <w:bCs/>
               </w:rPr>
             </w:r>
+          </w:p>
+        </w:tc>
+      </w:tr>
+      <w:tr>
+        <w:tc>
+          <w:tcPr>
+            <w:tcBorders>
+              <w:top w:val="single" w:color="CCCCCC" w:sz="1"/>
+              <w:left w:val="single" w:color="CCCCCC" w:sz="1"/>
+              <w:bottom w:val="single" w:color="CCCCCC" w:sz="1"/>
+              <w:right w:val="single" w:color="CCCCCC" w:sz="1"/>
+            </w:tcBorders>
+          </w:tcPr>
+          <w:p>
+            <w:r/>
+          </w:p>
+        </w:tc>
+        <w:tc>
+          <w:tcPr>
+            <w:tcBorders>
+              <w:top w:val="single" w:color="CCCCCC" w:sz="1"/>
+              <w:left w:val="single" w:color="CCCCCC" w:sz="1"/>
+              <w:bottom w:val="single" w:color="CCCCCC" w:sz="1"/>
+              <w:right w:val="single" w:color="CCCCCC" w:sz="1"/>
+            </w:tcBorders>
+          </w:tcPr>
+          <w:p>
+            <w:r/>
+          </w:p>
+        </w:tc>
+        <w:tc>
+          <w:tcPr>
+            <w:tcBorders>
+              <w:top w:val="single" w:color="CCCCCC" w:sz="1"/>
+              <w:left w:val="single" w:color="CCCCCC" w:sz="1"/>
+              <w:bottom w:val="single" w:color="CCCCCC" w:sz="1"/>
+              <w:right w:val="single" w:color="CCCCCC" w:sz="1"/>
+            </w:tcBorders>
+          </w:tcPr>
+          <w:p>
+            <w:r/>
           </w:p>
         </w:tc>
       </w:tr>

</xml_diff>